<commit_message>
docs: rebuild .docx outputs from the corrected generators
Regenerate the paper/proposal/report .docx from the updated generators so the
documents match the honest, corrected far-field narrative (near-field lab-
validated; far-field conservative ~35:1 vs documented 45:1, not field-validated;
lock-exchange Fr_f~0.40 PDE-core check). The stale "reproduces the field-
validated 45:1 to ~2.3%" claim is removed from all rebuilt documents.

Rebuilt: phd_proposal.docx, phd_proposal2.docx, 3/source.docx, 3/explain5.docx,
3/update_report.docx, 4/research_paper_brine.docx. (2/discuss_result3.docx is
rebuilt on disk but stays gitignored; res_paper_brine.docx builds to $HOME.)
</commit_message>
<xml_diff>
--- a/phd_proposal.docx
+++ b/phd_proposal.docx
@@ -4,7 +4,7 @@
   <w:body>
     <w:p>
       <w:pPr>
-        <w:spacing w:after="320"/>
+        <w:spacing w:after="360"/>
         <w:jc w:val="center"/>
       </w:pPr>
       <w:r>
@@ -15,7 +15,7 @@
           <w:color w:val="555555"/>
           <w:sz w:val="26"/>
         </w:rPr>
-        <w:t>DOCTORAL RESEARCH PROPOSAL — PhD (Comprehensive)</w:t>
+        <w:t>DOCTORAL RESEARCH PROPOSAL (PhD)</w:t>
       </w:r>
     </w:p>
     <w:p>
@@ -27,9 +27,9 @@
           <w:rFonts w:ascii="Calibri" w:hAnsi="Calibri"/>
           <w:b/>
           <w:color w:val="1F4E79"/>
-          <w:sz w:val="42"/>
+          <w:sz w:val="44"/>
         </w:rPr>
-        <w:t>A Coupled Stochastic Partial-Differential-Equation Framework for Predicting Salinity Dispersion from Submarine Brine Outfalls</w:t>
+        <w:t>Coupled Stochastic Partial-Differential-Equation Modelling of Salinity Dispersion from Submarine Brine Outfalls</w:t>
       </w:r>
     </w:p>
     <w:p>
@@ -42,12 +42,12 @@
           <w:i/>
           <w:sz w:val="28"/>
         </w:rPr>
-        <w:t>Development, Field Validation and Application of the NEREID-B Near-Field/Far-Field Model for Desalination Brine Plumes</w:t>
+        <w:t>Development, Validation and Application of the NEREID-B Framework for Near-Field and Far-Field Prediction of Desalination Brine Plumes</w:t>
       </w:r>
     </w:p>
     <w:p>
       <w:pPr>
-        <w:spacing w:after="360"/>
+        <w:spacing w:after="400"/>
       </w:pPr>
     </w:p>
     <w:p>
@@ -103,14 +103,14 @@
           <w:b/>
           <w:sz w:val="22"/>
         </w:rPr>
-        <w:t xml:space="preserve">Supervisors:  </w:t>
+        <w:t xml:space="preserve">Supervisory team:  </w:t>
       </w:r>
       <w:r>
         <w:rPr>
           <w:rFonts w:ascii="Calibri" w:hAnsi="Calibri"/>
           <w:sz w:val="22"/>
         </w:rPr>
-        <w:t>[Principal supervisor]; [Co-supervisor]</w:t>
+        <w:t>[Principal supervisor] · [Co-supervisor]</w:t>
       </w:r>
     </w:p>
     <w:p>
@@ -124,7 +124,7 @@
           <w:b/>
           <w:sz w:val="22"/>
         </w:rPr>
-        <w:t xml:space="preserve">Host:  </w:t>
+        <w:t xml:space="preserve">Department / Institution:  </w:t>
       </w:r>
       <w:r>
         <w:rPr>
@@ -145,14 +145,14 @@
           <w:b/>
           <w:sz w:val="22"/>
         </w:rPr>
-        <w:t xml:space="preserve">Mode / duration:  </w:t>
+        <w:t xml:space="preserve">Proposed duration:  </w:t>
       </w:r>
       <w:r>
         <w:rPr>
           <w:rFonts w:ascii="Calibri" w:hAnsi="Calibri"/>
           <w:sz w:val="22"/>
         </w:rPr>
-        <w:t>Full-time, 3.5–4 years</w:t>
+        <w:t>3–4 years (full-time)</w:t>
       </w:r>
     </w:p>
     <w:p>
@@ -166,7 +166,7 @@
           <w:b/>
           <w:sz w:val="22"/>
         </w:rPr>
-        <w:t xml:space="preserve">Submission date:  </w:t>
+        <w:t xml:space="preserve">Date:  </w:t>
       </w:r>
       <w:r>
         <w:rPr>
@@ -200,7 +200,7 @@
           <w:i w:val="0"/>
           <w:sz w:val="22"/>
         </w:rPr>
-        <w:t>Seawater desalination now exceeds 95 Mm³/day globally and continues to grow; its hyper-saline reject (brine), discharged to the sea, is a leading marine-environmental concern because the dense effluent sinks, pools on the seabed and can exceed the salinity tolerance of benthic ecosystems. Reliable prediction of the three-dimensional, time-evolving salinity field around an outfall — together with a calibrated measure of uncertainty arising from the unpredictable sea — is essential for outfall design and regulatory consent, yet current tools are limited: integral jet models (CORMIX/VISJET) cannot resolve the unsteady 3-D far field, while Boussinesq CFD neglects the large brine/ambient density contrast and treats the sea deterministically.</w:t>
+        <w:t>Seawater desalination is expanding rapidly worldwide, and the hyper-saline reject (brine) it discharges into the sea is a growing environmental concern: dense brine sinks, pools on the seabed and can raise salinity above the tolerance of benthic ecosystems. Predicting where, how far and how deep the elevated-salinity field extends — and with what certainty, given the unpredictable sea — is essential for outfall design and regulatory consent, yet existing tools are limited: integral jet models (CORMIX/VISJET) collapse the plume to a centreline and cannot resolve the unsteady far field, while conventional Boussinesq CFD neglects the large brine/ambient density contrast and treats the sea deterministically.</w:t>
       </w:r>
     </w:p>
     <w:p>
@@ -214,26 +214,7 @@
           <w:i w:val="0"/>
           <w:sz w:val="22"/>
         </w:rPr>
-        <w:t>This research develops, validates and applies NEREID-B, a novel coupled, unsteady, non-Boussinesq, stochastic partial-differential-equation (PDE) framework that solves the velocity, pressure, density, salinity, temperature, turbulence and free-surface fields simultaneously, closed by a nonlinear equation of state, irreversible-thermodynamics (Soret/Dufour) cross-diffusion and an explicit osmotic/reverse-osmosis coupling, and forced by intrinsic space-time stochastic noise so the model returns the probability distribution of salinity rather than a single value. A validated near-field/far-field coupling embeds the unresolvable diffuser jet through calibrated correlations. Extensive preliminary work — full model formulation, a robust verified solver, near-field validation against laboratory scaling, far-field grid-convergence, and two industrial case studies demonstrating that diffuser port spacing is a first-order control on impact — establishes proof of concept. The doctoral programme will extend the physics (non-Boussinesq continuity, multi-ion chemistry, higher-order numerics), deliver the first field validation of the coupled framework against CTD/ADCP surveys at an operating outfall, build a machine-learning surrogate for rapid probabilistic compliance screening, and release an open decision-support tool. The contribution is a new, validated, uncertainty-aware predictive capability for brine-outfall salinity dispersion, directly serving desalination engineering and marine environmental regulation.</w:t>
-      </w:r>
-    </w:p>
-    <w:p>
-      <w:pPr>
-        <w:spacing w:after="120"/>
-      </w:pPr>
-      <w:r>
-        <w:rPr>
-          <w:rFonts w:ascii="Calibri" w:hAnsi="Calibri"/>
-          <w:b w:val="0"/>
-          <w:i/>
-          <w:sz w:val="20"/>
-        </w:rPr>
-        <w:t>Keywords: brine dispersion; desalination outfall; dense jet; coupled PDE; stochastic modelling; uncertainty quantification; near-field/far-field coupling; salinity; environmental fluid mechanics.</w:t>
-      </w:r>
-    </w:p>
-    <w:p>
-      <w:r>
-        <w:br w:type="page"/>
+        <w:t>This research proposes the development, rigorous validation and application of NEREID-B — a novel coupled, unsteady, non-Boussinesq, stochastic partial-differential-equation (PDE) framework that solves the velocity, pressure, density, salinity, temperature, turbulence and free-surface fields simultaneously, closed by a nonlinear equation of state, irreversible-thermodynamics cross-diffusion and an explicit osmotic/reverse-osmosis coupling, with the sea's unpredictability represented as intrinsic stochastic forcing so the model returns the probability distribution of the salinity field rather than a single deterministic answer. A validated near-field/far-field coupling embeds the unresolvable diffuser jet through calibrated correlations and seeds the 3-D far field with the diluted plume. Substantial preliminary work — a complete model formulation, a robust solver, automated verification, near-field validation against laboratory scaling, grid-convergence of the far field, and two industrial case studies — establishes proof of concept. The doctoral programme will (i) extend the physics (non-Boussinesq continuity, multi-ion chemistry, higher-order numerics), (ii) deliver the first field validation of the coupled framework against CTD/ADCP surveys at an operating outfall, (iii) develop a machine-learning surrogate for rapid probabilistic screening, and (iv) release an open, validated decision-support tool. The expected contribution is a new, validated, uncertainty-aware predictive capability for brine-outfall salinity dispersion, of direct value to desalination engineering and marine environmental regulation.</w:t>
       </w:r>
     </w:p>
     <w:p>
@@ -241,15 +222,7 @@
         <w:pStyle w:val="Heading1"/>
       </w:pPr>
       <w:r>
-        <w:t>1. Introduction</w:t>
-      </w:r>
-    </w:p>
-    <w:p>
-      <w:pPr>
-        <w:pStyle w:val="Heading2"/>
-      </w:pPr>
-      <w:r>
-        <w:t>1.1 Background and context</w:t>
+        <w:t>1. Introduction and Background</w:t>
       </w:r>
     </w:p>
     <w:p>
@@ -263,7 +236,7 @@
           <w:i w:val="0"/>
           <w:sz w:val="22"/>
         </w:rPr>
-        <w:t>Water scarcity, intensified by climate change, population growth and over-abstraction, has made desalination a cornerstone of water security in arid and coastal regions. Seawater reverse osmosis (SWRO) dominates new capacity but recovers only ~40–50 % of the feed as product; the remainder is rejected as a brine typically 1.5–2× the ambient salinity, often warmer and containing residual antiscalants and cleaning chemicals. This reject is overwhelmingly returned to the sea through submarine outfalls, most modern installations using inclined multiport diffusers to promote rapid near-field dilution.</w:t>
+        <w:t>Global desalination capacity now exceeds 95 million m³/day and is growing to meet water scarcity intensified by climate change and population growth. Seawater reverse osmosis (SWRO), the dominant technology, recovers only ~40–50% of the feed as fresh water; the remainder is rejected as a brine roughly twice as saline as the receiving sea, frequently warmer and carrying residual process chemicals. This brine is overwhelmingly discharged back to the sea through submarine outfalls. Because it is denser than seawater it behaves as a negatively-buoyant effluent: it sinks, hugs the seabed and spreads as a gravity current, with documented impacts on seagrass, benthic invertebrates and other salinity-sensitive biota.</w:t>
       </w:r>
     </w:p>
     <w:p>
@@ -277,15 +250,15 @@
           <w:i w:val="0"/>
           <w:sz w:val="22"/>
         </w:rPr>
-        <w:t>Because the reject is denser than seawater it is a negatively-buoyant effluent: discharged as an inclined jet it rises, bends over under gravity, falls back to the seabed and spreads as a bottom-hugging gravity current. Field and laboratory studies have linked the resulting salinity increment to stress and mortality in seagrasses (e.g. Posidonia), echinoderms and other osmoconforming benthic biota. Consequently, regulators worldwide impose salinity-increment limits at the edge of a defined mixing zone, and operators must demonstrate compliance by predictive modelling at the consenting stage and by monitoring thereafter.</w:t>
+        <w:t>Regulators increasingly impose a maximum salinity increment (commonly +2 to +5 % of ambient, or a fixed limit such as +2 g kg⁻¹) at the edge of a permitted mixing zone. Demonstrating compliance requires predicting the three-dimensional, time-evolving salinity field around the diffuser — across both the energetic NEAR FIELD (the buoyant jet, the first tens of metres, where most dilution occurs) and the FAR FIELD (the bottom gravity current spreading over hundreds of metres under currents, tides and waves). The sea is never static or predictable, so a defensible prediction must also quantify the uncertainty arising from that variability.</w:t>
       </w:r>
     </w:p>
     <w:p>
       <w:pPr>
-        <w:pStyle w:val="Heading2"/>
+        <w:pStyle w:val="Heading1"/>
       </w:pPr>
       <w:r>
-        <w:t>1.2 Statement of the problem</w:t>
+        <w:t>2. Problem Statement and Research Gap</w:t>
       </w:r>
     </w:p>
     <w:p>
@@ -299,15 +272,46 @@
           <w:i w:val="0"/>
           <w:sz w:val="22"/>
         </w:rPr>
-        <w:t>Predicting outfall impact requires resolving the salinity field across two coupled regimes — the energetic near field (the buoyant jet) and the unsteady far field (the bottom gravity current under currents, tides, waves and stratification) — and quantifying the uncertainty introduced by the sea's variability. No existing tool does all three: integral models capture near-field dilution but not the 3-D unsteady far field; CFD resolves the far field but assumes small density differences and runs deterministically. The problem this research addresses is the absence of a single, validated, uncertainty-aware framework spanning both regimes for dense brine effluent.</w:t>
+        <w:t>Current predictive practice rests on tools with complementary but fundamental limitations:</w:t>
       </w:r>
     </w:p>
     <w:p>
       <w:pPr>
-        <w:pStyle w:val="Heading2"/>
+        <w:pStyle w:val="ListBullet"/>
+        <w:spacing w:after="40"/>
       </w:pPr>
       <w:r>
-        <w:t>1.3 Rationale and motivation</w:t>
+        <w:rPr>
+          <w:rFonts w:ascii="Calibri" w:hAnsi="Calibri"/>
+          <w:sz w:val="22"/>
+        </w:rPr>
+        <w:t>Integral / entrainment models (CORMIX, VISJET, JETLAG) reproduce near-field jet dilution well but reduce the plume to a 1-D centreline; they cannot resolve the unsteady 3-D far field, bathymetric steering, stratification, or the full sea state.</w:t>
+      </w:r>
+    </w:p>
+    <w:p>
+      <w:pPr>
+        <w:pStyle w:val="ListBullet"/>
+        <w:spacing w:after="40"/>
+      </w:pPr>
+      <w:r>
+        <w:rPr>
+          <w:rFonts w:ascii="Calibri" w:hAnsi="Calibri"/>
+          <w:sz w:val="22"/>
+        </w:rPr>
+        <w:t>Boussinesq Reynolds-Averaged Navier–Stokes / CFD models resolve the 3-D field but assume a small density difference — invalid for hyper-saline reject where (ρ−ρ₀)/ρ₀ can exceed 0.04 — and require infeasible near-nozzle resolution.</w:t>
+      </w:r>
+    </w:p>
+    <w:p>
+      <w:pPr>
+        <w:pStyle w:val="ListBullet"/>
+        <w:spacing w:after="40"/>
+      </w:pPr>
+      <w:r>
+        <w:rPr>
+          <w:rFonts w:ascii="Calibri" w:hAnsi="Calibri"/>
+          <w:sz w:val="22"/>
+        </w:rPr>
+        <w:t>Both families treat the sea deterministically, omit osmotic and irreversible-thermodynamic couplings, and provide no calibrated measure of predictive uncertainty.</w:t>
       </w:r>
     </w:p>
     <w:p>
@@ -321,15 +325,15 @@
           <w:i w:val="0"/>
           <w:sz w:val="22"/>
         </w:rPr>
-        <w:t>The gap is both scientifically significant and practically urgent. Scientifically, dense effluent dispersion couples non-Boussinesq buoyancy, stratified turbulence, anisotropic dispersion and stochastic forcing in ways not previously unified or validated. Practically, the rapid global expansion of desalination, alongside tightening marine protection regimes, creates strong demand for a credible, risk-based predictive capability that supports low-impact outfall design and evidence-based consenting.</w:t>
+        <w:t>The research gap is therefore the absence of a single, validated, uncertainty-aware framework that couples an accurate near field to a non-Boussinesq, stochastic far field and reports the probability distribution of salinity. Addressing this gap is the purpose of this PhD.</w:t>
       </w:r>
     </w:p>
     <w:p>
       <w:pPr>
-        <w:pStyle w:val="Heading2"/>
+        <w:pStyle w:val="Heading1"/>
       </w:pPr>
       <w:r>
-        <w:t>1.4 Aim, objectives, questions and hypotheses</w:t>
+        <w:t>3. Research Questions and Hypotheses</w:t>
       </w:r>
     </w:p>
     <w:p>
@@ -343,21 +347,7 @@
           <w:i w:val="0"/>
           <w:sz w:val="22"/>
         </w:rPr>
-        <w:t>Aim: to develop, validate and apply a coupled stochastic PDE framework (NEREID-B) for predicting near- and far-field salinity distribution and its uncertainty around submarine brine outfalls.</w:t>
-      </w:r>
-    </w:p>
-    <w:p>
-      <w:pPr>
-        <w:spacing w:after="40"/>
-      </w:pPr>
-      <w:r>
-        <w:rPr>
-          <w:rFonts w:ascii="Calibri" w:hAnsi="Calibri"/>
-          <w:b/>
-          <w:i w:val="0"/>
-          <w:sz w:val="22"/>
-        </w:rPr>
-        <w:t>Research questions:</w:t>
+        <w:t>The programme is organised around four questions:</w:t>
       </w:r>
     </w:p>
     <w:p>
@@ -370,7 +360,7 @@
           <w:rFonts w:ascii="Calibri" w:hAnsi="Calibri"/>
           <w:sz w:val="22"/>
         </w:rPr>
-        <w:t>Can a coupled stochastic PDE framework predict the unsteady 3-D salinity field of a brine outfall more completely than existing tools while remaining robust and affordable?</w:t>
+        <w:t>Can a coupled stochastic PDE framework predict the 3-D, unsteady salinity distribution of a brine outfall more completely than existing tools, while remaining numerically robust and affordable?</w:t>
       </w:r>
     </w:p>
     <w:p>
@@ -383,7 +373,7 @@
           <w:rFonts w:ascii="Calibri" w:hAnsi="Calibri"/>
           <w:sz w:val="22"/>
         </w:rPr>
-        <w:t>How accurately can a near-field/far-field coupling reproduce measured dilution and footprint at an operating outfall?</w:t>
+        <w:t>How accurately can a near-field/far-field coupling reproduce measured near-field dilution and far-field footprint at an operating outfall?</w:t>
       </w:r>
     </w:p>
     <w:p>
@@ -396,7 +386,7 @@
           <w:rFonts w:ascii="Calibri" w:hAnsi="Calibri"/>
           <w:sz w:val="22"/>
         </w:rPr>
-        <w:t>How do near-field jet merging and far-field gravity-current processes interact to determine impact and compliance?</w:t>
+        <w:t>How do near-field processes (jet merging at multiport diffusers) and far-field processes (gravity-current spreading, stratification, currents) interact to determine environmental impact and compliance?</w:t>
       </w:r>
     </w:p>
     <w:p>
@@ -409,12 +399,12 @@
           <w:rFonts w:ascii="Calibri" w:hAnsi="Calibri"/>
           <w:sz w:val="22"/>
         </w:rPr>
-        <w:t>What is the predictive uncertainty given the unpredictability of the sea, and can it be quantified efficiently for design?</w:t>
+        <w:t>What is the predictive uncertainty of the salinity field given the unpredictability of currents, tides, wind and turbulence, and can it be quantified efficiently for design and consenting?</w:t>
       </w:r>
     </w:p>
     <w:p>
       <w:pPr>
-        <w:spacing w:after="40"/>
+        <w:spacing w:after="120"/>
       </w:pPr>
       <w:r>
         <w:rPr>
@@ -423,12 +413,20 @@
           <w:i w:val="0"/>
           <w:sz w:val="22"/>
         </w:rPr>
-        <w:t>Central hypothesis: a coupled non-Boussinesq stochastic PDE model with a validated near-field closure can predict brine-plume salinity and its uncertainty to engineering/regulatory accuracy, outperforming single-paradigm tools.</w:t>
+        <w:t>Central hypothesis: a coupled non-Boussinesq stochastic PDE model, with a validated near-field closure, can predict brine-plume salinity distribution and its uncertainty with accuracy sufficient for engineering and regulatory use, outperforming single-paradigm tools.</w:t>
       </w:r>
     </w:p>
     <w:p>
       <w:pPr>
-        <w:spacing w:after="80"/>
+        <w:pStyle w:val="Heading1"/>
+      </w:pPr>
+      <w:r>
+        <w:t>4. Aim and Objectives</w:t>
+      </w:r>
+    </w:p>
+    <w:p>
+      <w:pPr>
+        <w:spacing w:after="120"/>
       </w:pPr>
       <w:r>
         <w:rPr>
@@ -437,21 +435,7 @@
           <w:i w:val="0"/>
           <w:sz w:val="22"/>
         </w:rPr>
-        <w:t>Specific objectives are listed in Table 1.1.</w:t>
-      </w:r>
-    </w:p>
-    <w:p>
-      <w:pPr>
-        <w:spacing w:after="40"/>
-      </w:pPr>
-      <w:r>
-        <w:rPr>
-          <w:rFonts w:ascii="Calibri" w:hAnsi="Calibri"/>
-          <w:b w:val="0"/>
-          <w:i/>
-          <w:sz w:val="22"/>
-        </w:rPr>
-        <w:t>Table 1.1 — Objectives and status at proposal</w:t>
+        <w:t>Aim: to develop, validate and apply a novel coupled stochastic PDE framework (NEREID-B) for predicting the near- and far-field salinity distribution and its uncertainty around submarine brine outfalls.</w:t>
       </w:r>
     </w:p>
     <w:tbl>
@@ -469,7 +453,7 @@
       <w:tr>
         <w:tc>
           <w:tcPr>
-            <w:tcW w:type="dxa" w:w="576"/>
+            <w:tcW w:type="dxa" w:w="720"/>
             <w:shd w:val="clear" w:color="auto" w:fill="1F4E79"/>
           </w:tcPr>
           <w:p>
@@ -487,7 +471,7 @@
         </w:tc>
         <w:tc>
           <w:tcPr>
-            <w:tcW w:type="dxa" w:w="6192"/>
+            <w:tcW w:type="dxa" w:w="6048"/>
             <w:shd w:val="clear" w:color="auto" w:fill="1F4E79"/>
           </w:tcPr>
           <w:p>
@@ -505,7 +489,7 @@
         </w:tc>
         <w:tc>
           <w:tcPr>
-            <w:tcW w:type="dxa" w:w="1872"/>
+            <w:tcW w:type="dxa" w:w="2592"/>
             <w:shd w:val="clear" w:color="auto" w:fill="1F4E79"/>
           </w:tcPr>
           <w:p>
@@ -517,7 +501,7 @@
                 <w:color w:val="FFFFFF"/>
                 <w:sz w:val="18"/>
               </w:rPr>
-              <w:t>Status</w:t>
+              <w:t>Status at proposal</w:t>
             </w:r>
           </w:p>
         </w:tc>
@@ -525,7 +509,7 @@
       <w:tr>
         <w:tc>
           <w:tcPr>
-            <w:tcW w:type="dxa" w:w="576"/>
+            <w:tcW w:type="dxa" w:w="720"/>
           </w:tcPr>
           <w:p>
             <w:r/>
@@ -540,7 +524,7 @@
         </w:tc>
         <w:tc>
           <w:tcPr>
-            <w:tcW w:type="dxa" w:w="6192"/>
+            <w:tcW w:type="dxa" w:w="6048"/>
           </w:tcPr>
           <w:p>
             <w:r/>
@@ -549,13 +533,13 @@
                 <w:rFonts w:ascii="Calibri" w:hAnsi="Calibri"/>
                 <w:sz w:val="18"/>
               </w:rPr>
-              <w:t>Formulate the coupled non-Boussinesq stochastic PDE system</w:t>
+              <w:t>Formulate the coupled non-Boussinesq stochastic PDE system with osmotic and cross-diffusion couplings</w:t>
             </w:r>
           </w:p>
         </w:tc>
         <w:tc>
           <w:tcPr>
-            <w:tcW w:type="dxa" w:w="1872"/>
+            <w:tcW w:type="dxa" w:w="2592"/>
           </w:tcPr>
           <w:p>
             <w:r/>
@@ -564,7 +548,7 @@
                 <w:rFonts w:ascii="Calibri" w:hAnsi="Calibri"/>
                 <w:sz w:val="18"/>
               </w:rPr>
-              <w:t>Done (prelim.)</w:t>
+              <w:t>Completed (preliminary)</w:t>
             </w:r>
           </w:p>
         </w:tc>
@@ -572,7 +556,7 @@
       <w:tr>
         <w:tc>
           <w:tcPr>
-            <w:tcW w:type="dxa" w:w="576"/>
+            <w:tcW w:type="dxa" w:w="720"/>
           </w:tcPr>
           <w:p>
             <w:r/>
@@ -587,7 +571,7 @@
         </w:tc>
         <w:tc>
           <w:tcPr>
-            <w:tcW w:type="dxa" w:w="6192"/>
+            <w:tcW w:type="dxa" w:w="6048"/>
           </w:tcPr>
           <w:p>
             <w:r/>
@@ -596,13 +580,13 @@
                 <w:rFonts w:ascii="Calibri" w:hAnsi="Calibri"/>
                 <w:sz w:val="18"/>
               </w:rPr>
-              <w:t>Develop a robust solver with near-field/far-field coupling</w:t>
+              <w:t>Develop a robust finite-volume solver with a validated near-field/far-field coupling</w:t>
             </w:r>
           </w:p>
         </w:tc>
         <w:tc>
           <w:tcPr>
-            <w:tcW w:type="dxa" w:w="1872"/>
+            <w:tcW w:type="dxa" w:w="2592"/>
           </w:tcPr>
           <w:p>
             <w:r/>
@@ -611,7 +595,7 @@
                 <w:rFonts w:ascii="Calibri" w:hAnsi="Calibri"/>
                 <w:sz w:val="18"/>
               </w:rPr>
-              <w:t>Done (prelim.)</w:t>
+              <w:t>Completed (preliminary)</w:t>
             </w:r>
           </w:p>
         </w:tc>
@@ -619,7 +603,7 @@
       <w:tr>
         <w:tc>
           <w:tcPr>
-            <w:tcW w:type="dxa" w:w="576"/>
+            <w:tcW w:type="dxa" w:w="720"/>
           </w:tcPr>
           <w:p>
             <w:r/>
@@ -634,7 +618,7 @@
         </w:tc>
         <w:tc>
           <w:tcPr>
-            <w:tcW w:type="dxa" w:w="6192"/>
+            <w:tcW w:type="dxa" w:w="6048"/>
           </w:tcPr>
           <w:p>
             <w:r/>
@@ -643,13 +627,13 @@
                 <w:rFonts w:ascii="Calibri" w:hAnsi="Calibri"/>
                 <w:sz w:val="18"/>
               </w:rPr>
-              <w:t>Verify robustness; validate near field vs lab scaling</w:t>
+              <w:t>Verify robustness and validate the near field against laboratory dense-jet scaling</w:t>
             </w:r>
           </w:p>
         </w:tc>
         <w:tc>
           <w:tcPr>
-            <w:tcW w:type="dxa" w:w="1872"/>
+            <w:tcW w:type="dxa" w:w="2592"/>
           </w:tcPr>
           <w:p>
             <w:r/>
@@ -658,7 +642,7 @@
                 <w:rFonts w:ascii="Calibri" w:hAnsi="Calibri"/>
                 <w:sz w:val="18"/>
               </w:rPr>
-              <w:t>Done (prelim.)</w:t>
+              <w:t>Completed (preliminary)</w:t>
             </w:r>
           </w:p>
         </w:tc>
@@ -666,7 +650,7 @@
       <w:tr>
         <w:tc>
           <w:tcPr>
-            <w:tcW w:type="dxa" w:w="576"/>
+            <w:tcW w:type="dxa" w:w="720"/>
           </w:tcPr>
           <w:p>
             <w:r/>
@@ -681,7 +665,7 @@
         </w:tc>
         <w:tc>
           <w:tcPr>
-            <w:tcW w:type="dxa" w:w="6192"/>
+            <w:tcW w:type="dxa" w:w="6048"/>
           </w:tcPr>
           <w:p>
             <w:r/>
@@ -690,13 +674,13 @@
                 <w:rFonts w:ascii="Calibri" w:hAnsi="Calibri"/>
                 <w:sz w:val="18"/>
               </w:rPr>
-              <w:t>Demonstrate stochastic uncertainty quantification</w:t>
+              <w:t>Quantify predictive uncertainty via stochastic ensembles</w:t>
             </w:r>
           </w:p>
         </w:tc>
         <w:tc>
           <w:tcPr>
-            <w:tcW w:type="dxa" w:w="1872"/>
+            <w:tcW w:type="dxa" w:w="2592"/>
           </w:tcPr>
           <w:p>
             <w:r/>
@@ -705,7 +689,7 @@
                 <w:rFonts w:ascii="Calibri" w:hAnsi="Calibri"/>
                 <w:sz w:val="18"/>
               </w:rPr>
-              <w:t>Done (prelim.)</w:t>
+              <w:t>Demonstrated (preliminary)</w:t>
             </w:r>
           </w:p>
         </w:tc>
@@ -713,7 +697,7 @@
       <w:tr>
         <w:tc>
           <w:tcPr>
-            <w:tcW w:type="dxa" w:w="576"/>
+            <w:tcW w:type="dxa" w:w="720"/>
           </w:tcPr>
           <w:p>
             <w:r/>
@@ -728,7 +712,7 @@
         </w:tc>
         <w:tc>
           <w:tcPr>
-            <w:tcW w:type="dxa" w:w="6192"/>
+            <w:tcW w:type="dxa" w:w="6048"/>
           </w:tcPr>
           <w:p>
             <w:r/>
@@ -737,13 +721,13 @@
                 <w:rFonts w:ascii="Calibri" w:hAnsi="Calibri"/>
                 <w:sz w:val="18"/>
               </w:rPr>
-              <w:t>Extend physics: non-Boussinesq, multi-ion, higher-order time</w:t>
+              <w:t>Extend the physics: non-Boussinesq continuity, multi-ion chemistry, higher-order numerics</w:t>
             </w:r>
           </w:p>
         </w:tc>
         <w:tc>
           <w:tcPr>
-            <w:tcW w:type="dxa" w:w="1872"/>
+            <w:tcW w:type="dxa" w:w="2592"/>
           </w:tcPr>
           <w:p>
             <w:r/>
@@ -760,7 +744,7 @@
       <w:tr>
         <w:tc>
           <w:tcPr>
-            <w:tcW w:type="dxa" w:w="576"/>
+            <w:tcW w:type="dxa" w:w="720"/>
           </w:tcPr>
           <w:p>
             <w:r/>
@@ -775,7 +759,7 @@
         </w:tc>
         <w:tc>
           <w:tcPr>
-            <w:tcW w:type="dxa" w:w="6192"/>
+            <w:tcW w:type="dxa" w:w="6048"/>
           </w:tcPr>
           <w:p>
             <w:r/>
@@ -784,13 +768,13 @@
                 <w:rFonts w:ascii="Calibri" w:hAnsi="Calibri"/>
                 <w:sz w:val="18"/>
               </w:rPr>
-              <w:t>Field-validate the far field (CTD/ADCP at an operating outfall)</w:t>
+              <w:t>Field-validate the far field against CTD/ADCP surveys at an operating outfall</w:t>
             </w:r>
           </w:p>
         </w:tc>
         <w:tc>
           <w:tcPr>
-            <w:tcW w:type="dxa" w:w="1872"/>
+            <w:tcW w:type="dxa" w:w="2592"/>
           </w:tcPr>
           <w:p>
             <w:r/>
@@ -807,7 +791,7 @@
       <w:tr>
         <w:tc>
           <w:tcPr>
-            <w:tcW w:type="dxa" w:w="576"/>
+            <w:tcW w:type="dxa" w:w="720"/>
           </w:tcPr>
           <w:p>
             <w:r/>
@@ -822,7 +806,7 @@
         </w:tc>
         <w:tc>
           <w:tcPr>
-            <w:tcW w:type="dxa" w:w="6192"/>
+            <w:tcW w:type="dxa" w:w="6048"/>
           </w:tcPr>
           <w:p>
             <w:r/>
@@ -831,13 +815,13 @@
                 <w:rFonts w:ascii="Calibri" w:hAnsi="Calibri"/>
                 <w:sz w:val="18"/>
               </w:rPr>
-              <w:t>Build an ML surrogate for probabilistic screening</w:t>
+              <w:t>Develop a machine-learning surrogate for rapid probabilistic screening</w:t>
             </w:r>
           </w:p>
         </w:tc>
         <w:tc>
           <w:tcPr>
-            <w:tcW w:type="dxa" w:w="1872"/>
+            <w:tcW w:type="dxa" w:w="2592"/>
           </w:tcPr>
           <w:p>
             <w:r/>
@@ -854,7 +838,7 @@
       <w:tr>
         <w:tc>
           <w:tcPr>
-            <w:tcW w:type="dxa" w:w="576"/>
+            <w:tcW w:type="dxa" w:w="720"/>
           </w:tcPr>
           <w:p>
             <w:r/>
@@ -869,7 +853,7 @@
         </w:tc>
         <w:tc>
           <w:tcPr>
-            <w:tcW w:type="dxa" w:w="6192"/>
+            <w:tcW w:type="dxa" w:w="6048"/>
           </w:tcPr>
           <w:p>
             <w:r/>
@@ -878,13 +862,13 @@
                 <w:rFonts w:ascii="Calibri" w:hAnsi="Calibri"/>
                 <w:sz w:val="18"/>
               </w:rPr>
-              <w:t>Apply to design/consenting cases; release open tool</w:t>
+              <w:t>Apply to design/consenting case studies and release an open decision-support tool</w:t>
             </w:r>
           </w:p>
         </w:tc>
         <w:tc>
           <w:tcPr>
-            <w:tcW w:type="dxa" w:w="1872"/>
+            <w:tcW w:type="dxa" w:w="2592"/>
           </w:tcPr>
           <w:p>
             <w:r/>
@@ -901,320 +885,10 @@
     </w:tbl>
     <w:p>
       <w:pPr>
-        <w:pStyle w:val="Heading2"/>
-      </w:pPr>
-      <w:r>
-        <w:t>1.5 Scope and delimitations</w:t>
-      </w:r>
-    </w:p>
-    <w:p>
-      <w:pPr>
-        <w:pStyle w:val="ListBullet"/>
-        <w:spacing w:after="40"/>
-      </w:pPr>
-      <w:r>
-        <w:rPr>
-          <w:rFonts w:ascii="Calibri" w:hAnsi="Calibri"/>
-          <w:sz w:val="22"/>
-        </w:rPr>
-        <w:t>Focus: salinity (and coupled temperature/density) dispersion from submarine brine outfalls in coastal seas; ecological dose–response is out of scope (the model supplies the salinity exposure that such assessments require).</w:t>
-      </w:r>
-    </w:p>
-    <w:p>
-      <w:pPr>
-        <w:pStyle w:val="ListBullet"/>
-        <w:spacing w:after="40"/>
-      </w:pPr>
-      <w:r>
-        <w:rPr>
-          <w:rFonts w:ascii="Calibri" w:hAnsi="Calibri"/>
-          <w:sz w:val="22"/>
-        </w:rPr>
-        <w:t>Spatial scope: from the diffuser nozzle to the far-field mixing zone (hundreds of metres); regional-scale circulation is imposed as forcing.</w:t>
-      </w:r>
-    </w:p>
-    <w:p>
-      <w:pPr>
-        <w:pStyle w:val="ListBullet"/>
-        <w:spacing w:after="40"/>
-      </w:pPr>
-      <w:r>
-        <w:rPr>
-          <w:rFonts w:ascii="Calibri" w:hAnsi="Calibri"/>
-          <w:sz w:val="22"/>
-        </w:rPr>
-        <w:t>The near field is represented by validated correlations rather than nozzle-resolving CFD, which is infeasible at field scale.</w:t>
-      </w:r>
-    </w:p>
-    <w:p>
-      <w:pPr>
-        <w:pStyle w:val="Heading2"/>
-      </w:pPr>
-      <w:r>
-        <w:t>1.6 Operational definitions</w:t>
-      </w:r>
-    </w:p>
-    <w:tbl>
-      <w:tblPr>
-        <w:tblStyle w:val="LightGrid-Accent1"/>
-        <w:tblW w:type="auto" w:w="0"/>
-        <w:jc w:val="center"/>
-        <w:tblLook w:firstColumn="1" w:firstRow="1" w:lastColumn="0" w:lastRow="0" w:noHBand="0" w:noVBand="1" w:val="04A0"/>
-      </w:tblPr>
-      <w:tblGrid>
-        <w:gridCol w:w="4320"/>
-        <w:gridCol w:w="4320"/>
-      </w:tblGrid>
-      <w:tr>
-        <w:tc>
-          <w:tcPr>
-            <w:tcW w:type="dxa" w:w="2304"/>
-            <w:shd w:val="clear" w:color="auto" w:fill="1F4E79"/>
-          </w:tcPr>
-          <w:p>
-            <w:r/>
-            <w:r>
-              <w:rPr>
-                <w:rFonts w:ascii="Calibri" w:hAnsi="Calibri"/>
-                <w:b/>
-                <w:color w:val="FFFFFF"/>
-                <w:sz w:val="18"/>
-              </w:rPr>
-              <w:t>Term</w:t>
-            </w:r>
-          </w:p>
-        </w:tc>
-        <w:tc>
-          <w:tcPr>
-            <w:tcW w:type="dxa" w:w="6624"/>
-            <w:shd w:val="clear" w:color="auto" w:fill="1F4E79"/>
-          </w:tcPr>
-          <w:p>
-            <w:r/>
-            <w:r>
-              <w:rPr>
-                <w:rFonts w:ascii="Calibri" w:hAnsi="Calibri"/>
-                <w:b/>
-                <w:color w:val="FFFFFF"/>
-                <w:sz w:val="18"/>
-              </w:rPr>
-              <w:t>Definition</w:t>
-            </w:r>
-          </w:p>
-        </w:tc>
-      </w:tr>
-      <w:tr>
-        <w:tc>
-          <w:tcPr>
-            <w:tcW w:type="dxa" w:w="2304"/>
-          </w:tcPr>
-          <w:p>
-            <w:r/>
-            <w:r>
-              <w:rPr>
-                <w:rFonts w:ascii="Calibri" w:hAnsi="Calibri"/>
-                <w:sz w:val="18"/>
-              </w:rPr>
-              <w:t>Near field</w:t>
-            </w:r>
-          </w:p>
-        </w:tc>
-        <w:tc>
-          <w:tcPr>
-            <w:tcW w:type="dxa" w:w="6624"/>
-          </w:tcPr>
-          <w:p>
-            <w:r/>
-            <w:r>
-              <w:rPr>
-                <w:rFonts w:ascii="Calibri" w:hAnsi="Calibri"/>
-                <w:sz w:val="18"/>
-              </w:rPr>
-              <w:t>The momentum/buoyancy-dominated jet region (first tens of metres) where most dilution occurs</w:t>
-            </w:r>
-          </w:p>
-        </w:tc>
-      </w:tr>
-      <w:tr>
-        <w:tc>
-          <w:tcPr>
-            <w:tcW w:type="dxa" w:w="2304"/>
-          </w:tcPr>
-          <w:p>
-            <w:r/>
-            <w:r>
-              <w:rPr>
-                <w:rFonts w:ascii="Calibri" w:hAnsi="Calibri"/>
-                <w:sz w:val="18"/>
-              </w:rPr>
-              <w:t>Far field</w:t>
-            </w:r>
-          </w:p>
-        </w:tc>
-        <w:tc>
-          <w:tcPr>
-            <w:tcW w:type="dxa" w:w="6624"/>
-          </w:tcPr>
-          <w:p>
-            <w:r/>
-            <w:r>
-              <w:rPr>
-                <w:rFonts w:ascii="Calibri" w:hAnsi="Calibri"/>
-                <w:sz w:val="18"/>
-              </w:rPr>
-              <w:t>The ambient-controlled region where the diluted, dense plume spreads as a bottom gravity current</w:t>
-            </w:r>
-          </w:p>
-        </w:tc>
-      </w:tr>
-      <w:tr>
-        <w:tc>
-          <w:tcPr>
-            <w:tcW w:type="dxa" w:w="2304"/>
-          </w:tcPr>
-          <w:p>
-            <w:r/>
-            <w:r>
-              <w:rPr>
-                <w:rFonts w:ascii="Calibri" w:hAnsi="Calibri"/>
-                <w:sz w:val="18"/>
-              </w:rPr>
-              <w:t>Dilution</w:t>
-            </w:r>
-          </w:p>
-        </w:tc>
-        <w:tc>
-          <w:tcPr>
-            <w:tcW w:type="dxa" w:w="6624"/>
-          </w:tcPr>
-          <w:p>
-            <w:r/>
-            <w:r>
-              <w:rPr>
-                <w:rFonts w:ascii="Calibri" w:hAnsi="Calibri"/>
-                <w:sz w:val="18"/>
-              </w:rPr>
-              <w:t>Ratio (S₀−S_amb)/(S−S_amb) of source-to-local excess salinity</w:t>
-            </w:r>
-          </w:p>
-        </w:tc>
-      </w:tr>
-      <w:tr>
-        <w:tc>
-          <w:tcPr>
-            <w:tcW w:type="dxa" w:w="2304"/>
-          </w:tcPr>
-          <w:p>
-            <w:r/>
-            <w:r>
-              <w:rPr>
-                <w:rFonts w:ascii="Calibri" w:hAnsi="Calibri"/>
-                <w:sz w:val="18"/>
-              </w:rPr>
-              <w:t>Densimetric Froude, Fr</w:t>
-            </w:r>
-          </w:p>
-        </w:tc>
-        <w:tc>
-          <w:tcPr>
-            <w:tcW w:type="dxa" w:w="6624"/>
-          </w:tcPr>
-          <w:p>
-            <w:r/>
-            <w:r>
-              <w:rPr>
-                <w:rFonts w:ascii="Calibri" w:hAnsi="Calibri"/>
-                <w:sz w:val="18"/>
-              </w:rPr>
-              <w:t>U/√(g′D): jet momentum vs buoyancy, g′=g(ρ−ρ_a)/ρ_a</w:t>
-            </w:r>
-          </w:p>
-        </w:tc>
-      </w:tr>
-      <w:tr>
-        <w:tc>
-          <w:tcPr>
-            <w:tcW w:type="dxa" w:w="2304"/>
-          </w:tcPr>
-          <w:p>
-            <w:r/>
-            <w:r>
-              <w:rPr>
-                <w:rFonts w:ascii="Calibri" w:hAnsi="Calibri"/>
-                <w:sz w:val="18"/>
-              </w:rPr>
-              <w:t>Mixing zone</w:t>
-            </w:r>
-          </w:p>
-        </w:tc>
-        <w:tc>
-          <w:tcPr>
-            <w:tcW w:type="dxa" w:w="6624"/>
-          </w:tcPr>
-          <w:p>
-            <w:r/>
-            <w:r>
-              <w:rPr>
-                <w:rFonts w:ascii="Calibri" w:hAnsi="Calibri"/>
-                <w:sz w:val="18"/>
-              </w:rPr>
-              <w:t>Permitted area within which the salinity-increment limit may be exceeded</w:t>
-            </w:r>
-          </w:p>
-        </w:tc>
-      </w:tr>
-      <w:tr>
-        <w:tc>
-          <w:tcPr>
-            <w:tcW w:type="dxa" w:w="2304"/>
-          </w:tcPr>
-          <w:p>
-            <w:r/>
-            <w:r>
-              <w:rPr>
-                <w:rFonts w:ascii="Calibri" w:hAnsi="Calibri"/>
-                <w:sz w:val="18"/>
-              </w:rPr>
-              <w:t>Stochastic PDE (SPDE)</w:t>
-            </w:r>
-          </w:p>
-        </w:tc>
-        <w:tc>
-          <w:tcPr>
-            <w:tcW w:type="dxa" w:w="6624"/>
-          </w:tcPr>
-          <w:p>
-            <w:r/>
-            <w:r>
-              <w:rPr>
-                <w:rFonts w:ascii="Calibri" w:hAnsi="Calibri"/>
-                <w:sz w:val="18"/>
-              </w:rPr>
-              <w:t>A PDE driven by random forcing, whose solution is a probability distribution of fields</w:t>
-            </w:r>
-          </w:p>
-        </w:tc>
-      </w:tr>
-    </w:tbl>
-    <w:p>
-      <w:r>
-        <w:br w:type="page"/>
-      </w:r>
-    </w:p>
-    <w:p>
-      <w:pPr>
         <w:pStyle w:val="Heading1"/>
       </w:pPr>
       <w:r>
-        <w:t>2. Literature Review and Theoretical Framework</w:t>
-      </w:r>
-    </w:p>
-    <w:p>
-      <w:pPr>
-        <w:pStyle w:val="Heading2"/>
-      </w:pPr>
-      <w:r>
-        <w:t>2.1 Brine discharge and environmental impact</w:t>
+        <w:t>5. Originality and Intended Contribution</w:t>
       </w:r>
     </w:p>
     <w:p>
@@ -1228,7 +902,85 @@
           <w:i w:val="0"/>
           <w:sz w:val="22"/>
         </w:rPr>
-        <w:t>Reviews (e.g. Roberts et al. 2010; Missimer &amp; Maliva 2018) document that elevated salinity from desalination outfalls is the dominant stressor on benthic communities, with thresholds as low as +1–2 g kg⁻¹ for sensitive seagrasses. Regulatory frameworks (e.g. in the Mediterranean, Gulf and Australia) accordingly set salinity-increment limits, motivating accurate predictive modelling.</w:t>
+        <w:t>The work is original in combining, in one self-consistent and validated framework, elements not previously brought together for brine dispersion:</w:t>
+      </w:r>
+    </w:p>
+    <w:p>
+      <w:pPr>
+        <w:pStyle w:val="ListBullet"/>
+        <w:spacing w:after="40"/>
+      </w:pPr>
+      <w:r>
+        <w:rPr>
+          <w:rFonts w:ascii="Calibri" w:hAnsi="Calibri"/>
+          <w:sz w:val="22"/>
+        </w:rPr>
+        <w:t>Osmotic / reverse-osmosis coupling: the osmotic-pressure gradient of the hyper-saline reject enters the salt flux as a thermodynamically consistent term, absent from conventional plume models.</w:t>
+      </w:r>
+    </w:p>
+    <w:p>
+      <w:pPr>
+        <w:pStyle w:val="ListBullet"/>
+        <w:spacing w:after="40"/>
+      </w:pPr>
+      <w:r>
+        <w:rPr>
+          <w:rFonts w:ascii="Calibri" w:hAnsi="Calibri"/>
+          <w:sz w:val="22"/>
+        </w:rPr>
+        <w:t>Intrinsic stochastic forcing: currents, tides, wind and turbulence are Ornstein–Uhlenbeck colored-noise fields, so the model is a genuine stochastic PDE returning the probability density of salinity — a mean plume plus a quantified confidence envelope.</w:t>
+      </w:r>
+    </w:p>
+    <w:p>
+      <w:pPr>
+        <w:pStyle w:val="ListBullet"/>
+        <w:spacing w:after="40"/>
+      </w:pPr>
+      <w:r>
+        <w:rPr>
+          <w:rFonts w:ascii="Calibri" w:hAnsi="Calibri"/>
+          <w:sz w:val="22"/>
+        </w:rPr>
+        <w:t>Non-Boussinesq buoyancy with a nonlinear equation of state, valid for the large brine/ambient density contrast.</w:t>
+      </w:r>
+    </w:p>
+    <w:p>
+      <w:pPr>
+        <w:pStyle w:val="ListBullet"/>
+        <w:spacing w:after="40"/>
+      </w:pPr>
+      <w:r>
+        <w:rPr>
+          <w:rFonts w:ascii="Calibri" w:hAnsi="Calibri"/>
+          <w:sz w:val="22"/>
+        </w:rPr>
+        <w:t>Onsager (Soret/Dufour) cross-diffusion and a full anisotropic, state-dependent dispersion tensor.</w:t>
+      </w:r>
+    </w:p>
+    <w:p>
+      <w:pPr>
+        <w:pStyle w:val="ListBullet"/>
+        <w:spacing w:after="40"/>
+      </w:pPr>
+      <w:r>
+        <w:rPr>
+          <w:rFonts w:ascii="Calibri" w:hAnsi="Calibri"/>
+          <w:sz w:val="22"/>
+        </w:rPr>
+        <w:t>A near-field/far-field coupling that combines lab-validated calibrated jet correlations with a grid-converged stochastic 3-D far field; the first field validation of such a coupled framework is a proposed contribution (the near field is lab-validated, while field validation of the far field remains a core objective requiring in-class CTD/ADCP survey data).</w:t>
+      </w:r>
+    </w:p>
+    <w:p>
+      <w:r>
+        <w:br w:type="page"/>
+      </w:r>
+    </w:p>
+    <w:p>
+      <w:pPr>
+        <w:pStyle w:val="Heading1"/>
+      </w:pPr>
+      <w:r>
+        <w:t>6. Methodology</w:t>
       </w:r>
     </w:p>
     <w:p>
@@ -1236,7 +988,7 @@
         <w:pStyle w:val="Heading2"/>
       </w:pPr>
       <w:r>
-        <w:t>2.2 Near-field jet and plume modelling</w:t>
+        <w:t>6.1 The coupled stochastic PDE model</w:t>
       </w:r>
     </w:p>
     <w:p>
@@ -1250,174 +1002,7 @@
           <w:i w:val="0"/>
           <w:sz w:val="22"/>
         </w:rPr>
-        <w:t>The near field of inclined dense jets has been characterised extensively by laboratory experiment and integral modelling. Roberts et al. (1997), Cipollina et al. (2005), Roberts &amp; Toms (1987), Lai &amp; Lee (2012) and Abessi &amp; Roberts (2015) established robust scaling for terminal rise, return distance and dilution as functions of the densimetric Froude number and nozzle angle (e.g. z_t/(D·Fr) ≈ 2.1–2.8 and return dilution S_r ≈ 1.6 Fr at 60°). Integral entrainment models (Jirka 2004; Lee &amp; Chu 2003) and the engineering tools CORMIX, VISJET and JETLAG encapsulate this knowledge but reduce the plume to a centreline and cannot represent the unsteady 3-D far field, complex bathymetry or the full sea state.</w:t>
-      </w:r>
-    </w:p>
-    <w:p>
-      <w:pPr>
-        <w:pStyle w:val="Heading2"/>
-      </w:pPr>
-      <w:r>
-        <w:t>2.3 Far-field and CFD modelling</w:t>
-      </w:r>
-    </w:p>
-    <w:p>
-      <w:pPr>
-        <w:spacing w:after="120"/>
-      </w:pPr>
-      <w:r>
-        <w:rPr>
-          <w:rFonts w:ascii="Calibri" w:hAnsi="Calibri"/>
-          <w:b w:val="0"/>
-          <w:i w:val="0"/>
-          <w:sz w:val="22"/>
-        </w:rPr>
-        <w:t>Far-field spreading has been modelled with shallow-water and 3-D hydrodynamic codes (e.g. Delft3D, ROMS, OpenFOAM-based RANS/LES). These resolve advection and dispersion but commonly invoke the Boussinesq approximation — questionable for hyper-saline reject — and require near-nozzle resolution that is infeasible at field scale, leading to the widely-used but loosely-coupled practice of hand-off from a near-field tool to a far-field model.</w:t>
-      </w:r>
-    </w:p>
-    <w:p>
-      <w:pPr>
-        <w:pStyle w:val="Heading2"/>
-      </w:pPr>
-      <w:r>
-        <w:t>2.4 Stochastic and uncertainty approaches</w:t>
-      </w:r>
-    </w:p>
-    <w:p>
-      <w:pPr>
-        <w:spacing w:after="120"/>
-      </w:pPr>
-      <w:r>
-        <w:rPr>
-          <w:rFonts w:ascii="Calibri" w:hAnsi="Calibri"/>
-          <w:b w:val="0"/>
-          <w:i w:val="0"/>
-          <w:sz w:val="22"/>
-        </w:rPr>
-        <w:t>Environmental flows are increasingly treated probabilistically (ensemble forecasting; polynomial chaos; stochastic PDEs). Such methods are established in oceanography and groundwater but have not been systematically applied to dense-effluent dispersion, where the unpredictability of currents, tides and wind strongly controls the footprint. Representing this variability intrinsically — rather than by ad hoc scenario runs — is a methodological opportunity.</w:t>
-      </w:r>
-    </w:p>
-    <w:p>
-      <w:pPr>
-        <w:pStyle w:val="Heading2"/>
-      </w:pPr>
-      <w:r>
-        <w:t>2.5 Thermodynamic and constitutive couplings</w:t>
-      </w:r>
-    </w:p>
-    <w:p>
-      <w:pPr>
-        <w:spacing w:after="120"/>
-      </w:pPr>
-      <w:r>
-        <w:rPr>
-          <w:rFonts w:ascii="Calibri" w:hAnsi="Calibri"/>
-          <w:b w:val="0"/>
-          <w:i w:val="0"/>
-          <w:sz w:val="22"/>
-        </w:rPr>
-        <w:t>The nonlinear seawater equation of state (TEOS-10; IOC et al. 2010) is essential for hyper-saline, stratified flows. Osmotic pressure, reverse-osmosis transport and Onsager (Soret/Dufour) cross-diffusion are well established in physical chemistry but are universally neglected in plume models; their role at the sharp brine front is unquantified.</w:t>
-      </w:r>
-    </w:p>
-    <w:p>
-      <w:pPr>
-        <w:pStyle w:val="Heading2"/>
-      </w:pPr>
-      <w:r>
-        <w:t>2.6 Synthesis and research gap</w:t>
-      </w:r>
-    </w:p>
-    <w:p>
-      <w:pPr>
-        <w:spacing w:after="120"/>
-      </w:pPr>
-      <w:r>
-        <w:rPr>
-          <w:rFonts w:ascii="Calibri" w:hAnsi="Calibri"/>
-          <w:b w:val="0"/>
-          <w:i w:val="0"/>
-          <w:sz w:val="22"/>
-        </w:rPr>
-        <w:t>The literature provides a validated near field, capable but Boussinesq and deterministic far-field codes, and mature but unexploited stochastic and thermodynamic methods. What is missing — and what this research provides — is their integration into one validated, non-Boussinesq, uncertainty-aware framework with a rigorously field-validated near-field/far-field coupling.</w:t>
-      </w:r>
-    </w:p>
-    <w:p>
-      <w:pPr>
-        <w:pStyle w:val="Heading2"/>
-      </w:pPr>
-      <w:r>
-        <w:t>2.7 Theoretical and conceptual framework</w:t>
-      </w:r>
-    </w:p>
-    <w:p>
-      <w:pPr>
-        <w:spacing w:after="120"/>
-      </w:pPr>
-      <w:r>
-        <w:rPr>
-          <w:rFonts w:ascii="Calibri" w:hAnsi="Calibri"/>
-          <w:b w:val="0"/>
-          <w:i w:val="0"/>
-          <w:sz w:val="22"/>
-        </w:rPr>
-        <w:t>The work is grounded in conservation-law continuum mechanics (mass, momentum, scalar transport) closed by irreversible thermodynamics (Onsager reciprocity, the nonlinear EOS) and stochastic-process theory (Ornstein–Uhlenbeck forcing, ensemble/Fokker–Planck description of the salinity PDF). Conceptually, environmental impact is modelled as a chain: discharge → validated near-field dilution → stochastic far-field gravity-current transport → probabilistic salinity exposure → compliance, with uncertainty propagated end-to-end.</w:t>
-      </w:r>
-    </w:p>
-    <w:p>
-      <w:r>
-        <w:br w:type="page"/>
-      </w:r>
-    </w:p>
-    <w:p>
-      <w:pPr>
-        <w:pStyle w:val="Heading1"/>
-      </w:pPr>
-      <w:r>
-        <w:t>3. Methodology</w:t>
-      </w:r>
-    </w:p>
-    <w:p>
-      <w:pPr>
-        <w:pStyle w:val="Heading2"/>
-      </w:pPr>
-      <w:r>
-        <w:t>3.1 Research design</w:t>
-      </w:r>
-    </w:p>
-    <w:p>
-      <w:pPr>
-        <w:spacing w:after="120"/>
-      </w:pPr>
-      <w:r>
-        <w:rPr>
-          <w:rFonts w:ascii="Calibri" w:hAnsi="Calibri"/>
-          <w:b w:val="0"/>
-          <w:i w:val="0"/>
-          <w:sz w:val="22"/>
-        </w:rPr>
-        <w:t>The study follows a model-development-and-validation design within a post-positivist, quantitative paradigm: a mathematical model is formulated, implemented, verified (correct solution of the equations) and validated (correct representation of reality) against laboratory and field data, then applied to answer the research questions. Verification and validation (V&amp;V) follow the established hierarchy (code verification → solution verification/grid-convergence → model validation → predictive use with quantified uncertainty).</w:t>
-      </w:r>
-    </w:p>
-    <w:p>
-      <w:pPr>
-        <w:pStyle w:val="Heading2"/>
-      </w:pPr>
-      <w:r>
-        <w:t>3.2 The coupled stochastic PDE model</w:t>
-      </w:r>
-    </w:p>
-    <w:p>
-      <w:pPr>
-        <w:spacing w:after="120"/>
-      </w:pPr>
-      <w:r>
-        <w:rPr>
-          <w:rFonts w:ascii="Calibri" w:hAnsi="Calibri"/>
-          <w:b w:val="0"/>
-          <w:i w:val="0"/>
-          <w:sz w:val="22"/>
-        </w:rPr>
-        <w:t>NEREID-B solves the state vector q = (ρ, u, p, S, T, k, ε, η):</w:t>
+        <w:t>NEREID-B solves the coupled state vector q = (ρ, u, p, S, T, k, ε, η). The governing balances are:</w:t>
       </w:r>
     </w:p>
     <w:p>
@@ -1482,7 +1067,7 @@
           <w:rFonts w:ascii="Cambria Math" w:hAnsi="Cambria Math"/>
           <w:sz w:val="24"/>
         </w:rPr>
-        <w:t>ρ = ρ_EOS(S,T,p)   (nonlinear TEOS-10)</w:t>
+        <w:t>ρ = ρ_EOS(S,T,p)   (nonlinear, TEOS-10)</w:t>
       </w:r>
     </w:p>
     <w:p>
@@ -1495,7 +1080,7 @@
           <w:rFonts w:ascii="Cambria Math" w:hAnsi="Cambria Math"/>
           <w:sz w:val="24"/>
         </w:rPr>
-        <w:t>∂ζ_m/∂t = −ζ_m/τ_m + σ_m 𝓛_m^{1/2} Ẇ_m(x,t)</w:t>
+        <w:t>∂ζ_m/∂t = −ζ_m/τ_m + σ_m 𝓛_m^{1/2} Ẇ_m   (stochastic forcing)</w:t>
       </w:r>
     </w:p>
     <w:p>
@@ -1509,59 +1094,15 @@
           <w:i w:val="0"/>
           <w:sz w:val="22"/>
         </w:rPr>
-        <w:t>Constitutive closures:</w:t>
+        <w:t>with the salt flux J_S = −ρ D_S·∇S − ρ D_ST ∇T − (ρ D_S L_p/R_gT) ∇Π fusing anisotropic dispersion, Soret cross-diffusion and the osmotic flux, and a buoyancy-modified k–ε closure for turbulence. Solving the ensemble of stochastic realisations yields P[S(x,t)].</w:t>
       </w:r>
     </w:p>
     <w:p>
       <w:pPr>
-        <w:pStyle w:val="ListBullet"/>
-        <w:spacing w:after="40"/>
+        <w:pStyle w:val="Heading2"/>
       </w:pPr>
       <w:r>
-        <w:rPr>
-          <w:rFonts w:ascii="Calibri" w:hAnsi="Calibri"/>
-          <w:sz w:val="22"/>
-        </w:rPr>
-        <w:t>Salt flux J_S = −ρ D_S·∇S − ρ D_ST∇T − (ρ D_S L_p/R_gT)∇Π, fusing a full anisotropic dispersion tensor, Soret cross-diffusion and the osmotic/RO flux.</w:t>
-      </w:r>
-    </w:p>
-    <w:p>
-      <w:pPr>
-        <w:pStyle w:val="ListBullet"/>
-        <w:spacing w:after="40"/>
-      </w:pPr>
-      <w:r>
-        <w:rPr>
-          <w:rFonts w:ascii="Calibri" w:hAnsi="Calibri"/>
-          <w:sz w:val="22"/>
-        </w:rPr>
-        <w:t>Osmotic pressure Π(S,T) by a Pitzer-corrected van 't Hoff law.</w:t>
-      </w:r>
-    </w:p>
-    <w:p>
-      <w:pPr>
-        <w:pStyle w:val="ListBullet"/>
-        <w:spacing w:after="40"/>
-      </w:pPr>
-      <w:r>
-        <w:rPr>
-          <w:rFonts w:ascii="Calibri" w:hAnsi="Calibri"/>
-          <w:sz w:val="22"/>
-        </w:rPr>
-        <w:t>Turbulence by a buoyancy-modified k–ε closure with a Smagorinsky dissipation floor.</w:t>
-      </w:r>
-    </w:p>
-    <w:p>
-      <w:pPr>
-        <w:pStyle w:val="ListBullet"/>
-        <w:spacing w:after="40"/>
-      </w:pPr>
-      <w:r>
-        <w:rPr>
-          <w:rFonts w:ascii="Calibri" w:hAnsi="Calibri"/>
-          <w:sz w:val="22"/>
-        </w:rPr>
-        <w:t>Stochastic forcing channels ζ_m (currents, tide, wind, sub-grid turbulence) as Ornstein–Uhlenbeck colored noise with prescribed de-correlation time and spatial length scale.</w:t>
+        <w:t>6.2 Numerical solver and near-field/far-field coupling</w:t>
       </w:r>
     </w:p>
     <w:p>
@@ -1575,7 +1116,7 @@
           <w:i w:val="0"/>
           <w:sz w:val="22"/>
         </w:rPr>
-        <w:t>Solving the ensemble yields the predictive salinity PDF P[S(x,t)], its mean, variance and exceedance probabilities.</w:t>
+        <w:t>The system is discretised by a MAC-consistent fractional-step projection on a terrain-following finite-volume grid with partial-cell bathymetry and an implicit free surface; scalars use a monotone TVD scheme. The unresolvable diffuser nozzle is represented by validated empirical dense-jet correlations, and the 3-D far field is seeded with the diluted return plume — a CORMIX/VISJET-class coupling that is accurate where each paradigm is valid.</w:t>
       </w:r>
     </w:p>
     <w:p>
@@ -1583,7 +1124,67 @@
         <w:pStyle w:val="Heading2"/>
       </w:pPr>
       <w:r>
-        <w:t>3.3 Numerical solver</w:t>
+        <w:t>6.3 Validation strategy</w:t>
+      </w:r>
+    </w:p>
+    <w:p>
+      <w:pPr>
+        <w:pStyle w:val="ListBullet"/>
+        <w:spacing w:after="40"/>
+      </w:pPr>
+      <w:r>
+        <w:rPr>
+          <w:rFonts w:ascii="Calibri" w:hAnsi="Calibri"/>
+          <w:sz w:val="22"/>
+        </w:rPr>
+        <w:t>Verification: automated invariant tests (conservation, boundedness, divergence control, monotonicity, bitwise-exact restart).</w:t>
+      </w:r>
+    </w:p>
+    <w:p>
+      <w:pPr>
+        <w:pStyle w:val="ListBullet"/>
+        <w:spacing w:after="40"/>
+      </w:pPr>
+      <w:r>
+        <w:rPr>
+          <w:rFonts w:ascii="Calibri" w:hAnsi="Calibri"/>
+          <w:sz w:val="22"/>
+        </w:rPr>
+        <w:t>Near-field validation: reproduction of published laboratory scaling for inclined dense jets (terminal rise, return-point dilution).</w:t>
+      </w:r>
+    </w:p>
+    <w:p>
+      <w:pPr>
+        <w:pStyle w:val="ListBullet"/>
+        <w:spacing w:after="40"/>
+      </w:pPr>
+      <w:r>
+        <w:rPr>
+          <w:rFonts w:ascii="Calibri" w:hAnsi="Calibri"/>
+          <w:sz w:val="22"/>
+        </w:rPr>
+        <w:t>Grid-convergence: systematic far-field mesh-refinement study.</w:t>
+      </w:r>
+    </w:p>
+    <w:p>
+      <w:pPr>
+        <w:pStyle w:val="ListBullet"/>
+        <w:spacing w:after="40"/>
+      </w:pPr>
+      <w:r>
+        <w:rPr>
+          <w:rFonts w:ascii="Calibri" w:hAnsi="Calibri"/>
+          <w:sz w:val="22"/>
+        </w:rPr>
+        <w:t>FIELD VALIDATION (proposed core contribution): CTD/ADCP/towed-sensor surveys at an operating SWRO outfall; comparison of predicted vs measured salinity profiles, footprint and dilution, with the predicted probability envelope tested for coverage.</w:t>
+      </w:r>
+    </w:p>
+    <w:p>
+      <w:pPr>
+        <w:pStyle w:val="Heading2"/>
+      </w:pPr>
+      <w:r>
+        <w:t>6.4 Case studies and uncertainty quantification</w:t>
       </w:r>
     </w:p>
     <w:p>
@@ -1597,15 +1198,15 @@
           <w:i w:val="0"/>
           <w:sz w:val="22"/>
         </w:rPr>
-        <w:t>A finite-volume, MAC-consistent fractional-step projection is used on a terrain-following grid with partial-cell (shaved-cell) bathymetry and an implicit free surface; scalars use a monotone TVD (van Leer) scheme; the constant-coefficient pressure-Poisson operator is LU-factorised once. Proposed extensions (WP2): a variable-density (non-Boussinesq) projection, second-order time integration, and multi-tracer (Maxwell–Stefan) transport.</w:t>
+        <w:t>Idealised and real-site cases will exercise the framework across discharge configurations (single-port, multiport with jet merging), sea states and bathymetries. Predictive uncertainty will be quantified by Monte-Carlo stochastic ensembles and, in WP4, by a polynomial-chaos / machine-learning surrogate for rapid probabilistic screening.</w:t>
       </w:r>
     </w:p>
     <w:p>
       <w:pPr>
-        <w:pStyle w:val="Heading2"/>
+        <w:pStyle w:val="Heading1"/>
       </w:pPr>
       <w:r>
-        <w:t>3.4 Near-field/far-field coupling</w:t>
+        <w:t>7. Preliminary Results (Proof of Concept)</w:t>
       </w:r>
     </w:p>
     <w:p>
@@ -1619,15 +1220,7 @@
           <w:i w:val="0"/>
           <w:sz w:val="22"/>
         </w:rPr>
-        <w:t>The sub-grid diffuser is represented by validated dense-jet correlations (rise, return point, dilution; with a multiport merging correction), and the 3-D far field is seeded with the diluted return plume. WP3 will refine and field-calibrate this coupling, including jet-merging at real multiport diffusers.</w:t>
-      </w:r>
-    </w:p>
-    <w:p>
-      <w:pPr>
-        <w:pStyle w:val="Heading2"/>
-      </w:pPr>
-      <w:r>
-        <w:t>3.5 Verification, validation and uncertainty quantification</w:t>
+        <w:t>Substantial preliminary work already establishes feasibility:</w:t>
       </w:r>
     </w:p>
     <w:p>
@@ -1640,7 +1233,7 @@
           <w:rFonts w:ascii="Calibri" w:hAnsi="Calibri"/>
           <w:sz w:val="22"/>
         </w:rPr>
-        <w:t>Verification: automated invariant tests (conservation, boundedness, divergence control, monotonicity, exact restart); method-of-manufactured-solutions for new physics (WP2).</w:t>
+        <w:t>Model and solver implemented and made numerically robust (passes a 6-check automated self-test, including machine-level divergence control and bitwise-exact checkpoint/restart).</w:t>
       </w:r>
     </w:p>
     <w:p>
@@ -1653,7 +1246,7 @@
           <w:rFonts w:ascii="Calibri" w:hAnsi="Calibri"/>
           <w:sz w:val="22"/>
         </w:rPr>
-        <w:t>Solution verification: systematic grid-convergence (Richardson extrapolation / GCI).</w:t>
+        <w:t>Near field validated: the modelled 60° dense-jet rise z_t/(D·Fr) = 2.20 lies squarely within the published laboratory band 2.1–2.8, with return-point dilution following the established S_r ≈ 1.6 Fr scaling.</w:t>
       </w:r>
     </w:p>
     <w:p>
@@ -1666,7 +1259,7 @@
           <w:rFonts w:ascii="Calibri" w:hAnsi="Calibri"/>
           <w:sz w:val="22"/>
         </w:rPr>
-        <w:t>Validation: laboratory dense-jet scaling (done); and the core field campaign (WP3) against CTD/ADCP/towed-sensor surveys at an operating outfall, testing predicted profiles, footprint, dilution and the probability-envelope coverage.</w:t>
+        <w:t>Far field shown grid-converged: peak excess salinity changes by 0 % between the medium and fine meshes (4.44 → 4.45 g kg⁻¹ across a 4× cell-count range), and an independent lock-exchange benchmark gives a front Froude number Fr_f ≈ 0.40, near the textbook ~0.5.</w:t>
       </w:r>
     </w:p>
     <w:p>
@@ -1679,15 +1272,20 @@
           <w:rFonts w:ascii="Calibri" w:hAnsi="Calibri"/>
           <w:sz w:val="22"/>
         </w:rPr>
-        <w:t>UQ: Monte-Carlo stochastic ensembles; Sobol sensitivity; and a polynomial-chaos / neural surrogate (WP4) for rapid screening.</w:t>
+        <w:t>Far field NOT yet field-validated: with the corrected buoyancy-modified k–ε closure (stratification now correctly damps turbulence), the model predicts ~35:1 dilution at 50 m for a Perth-class outfall, about 22 % below the documented field value of ~45:1 — i.e. it under-predicts dilution and so over-predicts impact, a conservative (safe) error. These far-field numbers are indicative and conservative; quantitative field validation is a remaining objective (WP3) requiring an in-class multi-point CTD/ADCP transect.</w:t>
       </w:r>
     </w:p>
     <w:p>
       <w:pPr>
-        <w:pStyle w:val="Heading2"/>
+        <w:pStyle w:val="ListBullet"/>
+        <w:spacing w:after="40"/>
       </w:pPr>
       <w:r>
-        <w:t>3.6 Field campaign and case-study design</w:t>
+        <w:rPr>
+          <w:rFonts w:ascii="Calibri" w:hAnsi="Calibri"/>
+          <w:sz w:val="22"/>
+        </w:rPr>
+        <w:t>Stochastic ensembles demonstrated, returning mean, spread and exceedance-probability maps of the salinity field.</w:t>
       </w:r>
     </w:p>
     <w:p>
@@ -1701,15 +1299,7 @@
           <w:i w:val="0"/>
           <w:sz w:val="22"/>
         </w:rPr>
-        <w:t>WP3 will instrument an operating SWRO outfall: vessel-based CTD casts and towed conductivity transects to map the salinity field, bottom-mounted ADCPs and a thermistor/conductivity mooring for the forcing and stratification, and met data for wind. Surveys will span tidal and seasonal states. Case studies (WP5) will cover single-port and multiport diffusers, stratified and energetic sites, to test generality and inform design guidance.</w:t>
-      </w:r>
-    </w:p>
-    <w:p>
-      <w:pPr>
-        <w:pStyle w:val="Heading2"/>
-      </w:pPr>
-      <w:r>
-        <w:t>3.7 Data management</w:t>
+        <w:t>A 150,000 m³/day SWRO outfall case was simulated in two diffuser configurations. Key preliminary findings (Table 2) show that diffuser port spacing — through jet merging — is a first-order control on environmental impact: closely-spaced ports cut near-field dilution from ~19× to ~8×, more than doubling the far-field peak excess and turning an essentially-compliant discharge into one with a ~17,800 m² regulatory mixing zone.</w:t>
       </w:r>
     </w:p>
     <w:p>
@@ -1720,117 +1310,10 @@
         <w:rPr>
           <w:rFonts w:ascii="Calibri" w:hAnsi="Calibri"/>
           <w:b w:val="0"/>
-          <w:i w:val="0"/>
-          <w:sz w:val="22"/>
-        </w:rPr>
-        <w:t>All field and model data will be version-controlled, documented with metadata (CF conventions), archived in an open repository where agreements permit, and released alongside the software to support reproducibility.</w:t>
-      </w:r>
-    </w:p>
-    <w:p>
-      <w:r>
-        <w:br w:type="page"/>
-      </w:r>
-    </w:p>
-    <w:p>
-      <w:pPr>
-        <w:pStyle w:val="Heading1"/>
-      </w:pPr>
-      <w:r>
-        <w:t>4. Preliminary Results (Proof of Concept)</w:t>
-      </w:r>
-    </w:p>
-    <w:p>
-      <w:pPr>
-        <w:spacing w:after="120"/>
-      </w:pPr>
-      <w:r>
-        <w:rPr>
-          <w:rFonts w:ascii="Calibri" w:hAnsi="Calibri"/>
-          <w:b w:val="0"/>
-          <w:i w:val="0"/>
-          <w:sz w:val="22"/>
-        </w:rPr>
-        <w:t>A complete preliminary implementation establishes feasibility and de-risks the programme:</w:t>
-      </w:r>
-    </w:p>
-    <w:p>
-      <w:pPr>
-        <w:pStyle w:val="ListBullet"/>
-        <w:spacing w:after="40"/>
-      </w:pPr>
-      <w:r>
-        <w:rPr>
-          <w:rFonts w:ascii="Calibri" w:hAnsi="Calibri"/>
-          <w:sz w:val="22"/>
-        </w:rPr>
-        <w:t>Robustness verified: the solver passes a six-check automated self-test (no NaN; salinity bounded; machine-level divergence control; EOS/transport monotonicity; bitwise-exact checkpoint/restart).</w:t>
-      </w:r>
-    </w:p>
-    <w:p>
-      <w:pPr>
-        <w:pStyle w:val="ListBullet"/>
-        <w:spacing w:after="40"/>
-      </w:pPr>
-      <w:r>
-        <w:rPr>
-          <w:rFonts w:ascii="Calibri" w:hAnsi="Calibri"/>
-          <w:sz w:val="22"/>
-        </w:rPr>
-        <w:t>Near field validated: modelled 60° dense-jet rise z_t/(D·Fr) = 2.20 lies within the published band 2.1–2.8; return dilution follows S_r ≈ 1.6 Fr (Figure 4.1).</w:t>
-      </w:r>
-    </w:p>
-    <w:p>
-      <w:pPr>
-        <w:pStyle w:val="ListBullet"/>
-        <w:spacing w:after="40"/>
-      </w:pPr>
-      <w:r>
-        <w:rPr>
-          <w:rFonts w:ascii="Calibri" w:hAnsi="Calibri"/>
-          <w:sz w:val="22"/>
-        </w:rPr>
-        <w:t>Far field grid-converged: peak excess salinity changes 0 % between the medium and fine meshes (4.44 → 4.45 g kg⁻¹ over a 4× cell-count range).</w:t>
-      </w:r>
-    </w:p>
-    <w:p>
-      <w:pPr>
-        <w:pStyle w:val="ListBullet"/>
-        <w:spacing w:after="40"/>
-      </w:pPr>
-      <w:r>
-        <w:rPr>
-          <w:rFonts w:ascii="Calibri" w:hAnsi="Calibri"/>
-          <w:sz w:val="22"/>
-        </w:rPr>
-        <w:t>Stochastic ensembles produce mean, spread and exceedance-probability maps of the salinity field.</w:t>
-      </w:r>
-    </w:p>
-    <w:p>
-      <w:pPr>
-        <w:spacing w:after="120"/>
-      </w:pPr>
-      <w:r>
-        <w:rPr>
-          <w:rFonts w:ascii="Calibri" w:hAnsi="Calibri"/>
-          <w:b w:val="0"/>
-          <w:i w:val="0"/>
-          <w:sz w:val="22"/>
-        </w:rPr>
-        <w:t>An industrial case — a 150,000 m³/day SWRO outfall — was simulated for two diffuser configurations. The results (Table 4.1, Figures 4.2–4.3) show that diffuser port spacing, through jet merging, is a first-order control on impact.</w:t>
-      </w:r>
-    </w:p>
-    <w:p>
-      <w:pPr>
-        <w:spacing w:after="40"/>
-      </w:pPr>
-      <w:r>
-        <w:rPr>
-          <w:rFonts w:ascii="Calibri" w:hAnsi="Calibri"/>
-          <w:b w:val="0"/>
           <w:i/>
           <w:sz w:val="22"/>
         </w:rPr>
-        <w:t>Table 4.1 — Preliminary case results (single-port vs merged multiport)</w:t>
+        <w:t>Table 2 — Preliminary case results (single-port vs merged multiport diffuser)</w:t>
       </w:r>
     </w:p>
     <w:tbl>
@@ -2148,7 +1631,7 @@
                 <w:rFonts w:ascii="Calibri" w:hAnsi="Calibri"/>
                 <w:sz w:val="18"/>
               </w:rPr>
-              <w:t>Compliance (far field)</w:t>
+              <w:t>Far-field compliance</w:t>
             </w:r>
           </w:p>
         </w:tc>
@@ -2234,7 +1717,7 @@
           <w:i/>
           <w:sz w:val="19"/>
         </w:rPr>
-        <w:t>Figure 4.1. Validated near-field inclined dense-jet trajectory; modelled rise and dilution match laboratory scaling.</w:t>
+        <w:t>Figure 1 (preliminary). Validated near-field inclined dense-jet trajectory; modelled rise and dilution match laboratory scaling.</w:t>
       </w:r>
     </w:p>
     <w:p>
@@ -2287,60 +1770,20 @@
           <w:i/>
           <w:sz w:val="19"/>
         </w:rPr>
-        <w:t>Figure 4.2. Predicted seabed excess-salinity footprint (merged diffuser) with the regulatory mixing-zone contour.</w:t>
+        <w:t>Figure 2 (preliminary). Predicted seabed excess-salinity footprint for the merged multiport diffuser, with the regulatory mixing-zone contour.</w:t>
+      </w:r>
+    </w:p>
+    <w:p>
+      <w:r>
+        <w:br w:type="page"/>
       </w:r>
     </w:p>
     <w:p>
       <w:pPr>
-        <w:jc w:val="center"/>
+        <w:pStyle w:val="Heading1"/>
       </w:pPr>
       <w:r>
-        <w:drawing>
-          <wp:inline xmlns:a="http://schemas.openxmlformats.org/drawingml/2006/main" xmlns:pic="http://schemas.openxmlformats.org/drawingml/2006/picture">
-            <wp:extent cx="5120640" cy="2867558"/>
-            <wp:docPr id="3" name="Picture 3"/>
-            <wp:cNvGraphicFramePr>
-              <a:graphicFrameLocks noChangeAspect="1"/>
-            </wp:cNvGraphicFramePr>
-            <a:graphic>
-              <a:graphicData uri="http://schemas.openxmlformats.org/drawingml/2006/picture">
-                <pic:pic>
-                  <pic:nvPicPr>
-                    <pic:cNvPr id="0" name="fig_vertical_section.png"/>
-                    <pic:cNvPicPr/>
-                  </pic:nvPicPr>
-                  <pic:blipFill>
-                    <a:blip r:embed="rId11"/>
-                    <a:stretch>
-                      <a:fillRect/>
-                    </a:stretch>
-                  </pic:blipFill>
-                  <pic:spPr>
-                    <a:xfrm>
-                      <a:off x="0" y="0"/>
-                      <a:ext cx="5120640" cy="2867558"/>
-                    </a:xfrm>
-                    <a:prstGeom prst="rect"/>
-                  </pic:spPr>
-                </pic:pic>
-              </a:graphicData>
-            </a:graphic>
-          </wp:inline>
-        </w:drawing>
-      </w:r>
-    </w:p>
-    <w:p>
-      <w:pPr>
-        <w:spacing w:after="200"/>
-        <w:jc w:val="center"/>
-      </w:pPr>
-      <w:r>
-        <w:rPr>
-          <w:rFonts w:ascii="Calibri" w:hAnsi="Calibri"/>
-          <w:i/>
-          <w:sz w:val="19"/>
-        </w:rPr>
-        <w:t>Figure 4.3. Vertical section: the dense plume is trapped near the bed and runs down-slope — the signature of a negatively-buoyant discharge.</w:t>
+        <w:t>8. Research Programme and Work Plan</w:t>
       </w:r>
     </w:p>
     <w:p>
@@ -2354,28 +1797,7 @@
           <w:i w:val="0"/>
           <w:sz w:val="22"/>
         </w:rPr>
-        <w:t>These results confirm that the framework is robust, near-field-validated and capable of resolving design-relevant differences — the foundation on which the proposed programme builds.</w:t>
-      </w:r>
-    </w:p>
-    <w:p>
-      <w:r>
-        <w:br w:type="page"/>
-      </w:r>
-    </w:p>
-    <w:p>
-      <w:pPr>
-        <w:pStyle w:val="Heading1"/>
-      </w:pPr>
-      <w:r>
-        <w:t>5. Research Programme, Timeline and Management</w:t>
-      </w:r>
-    </w:p>
-    <w:p>
-      <w:pPr>
-        <w:pStyle w:val="Heading2"/>
-      </w:pPr>
-      <w:r>
-        <w:t>5.1 Work packages</w:t>
+        <w:t>The programme is organised into six work packages (WP) over 3.5 years.</w:t>
       </w:r>
     </w:p>
     <w:tbl>
@@ -2412,7 +1834,7 @@
         </w:tc>
         <w:tc>
           <w:tcPr>
-            <w:tcW w:type="dxa" w:w="2016"/>
+            <w:tcW w:type="dxa" w:w="2160"/>
             <w:shd w:val="clear" w:color="auto" w:fill="1F4E79"/>
           </w:tcPr>
           <w:p>
@@ -2430,7 +1852,7 @@
         </w:tc>
         <w:tc>
           <w:tcPr>
-            <w:tcW w:type="dxa" w:w="4464"/>
+            <w:tcW w:type="dxa" w:w="4320"/>
             <w:shd w:val="clear" w:color="auto" w:fill="1F4E79"/>
           </w:tcPr>
           <w:p>
@@ -2483,7 +1905,7 @@
         </w:tc>
         <w:tc>
           <w:tcPr>
-            <w:tcW w:type="dxa" w:w="2016"/>
+            <w:tcW w:type="dxa" w:w="2160"/>
           </w:tcPr>
           <w:p>
             <w:r/>
@@ -2492,13 +1914,13 @@
                 <w:rFonts w:ascii="Calibri" w:hAnsi="Calibri"/>
                 <w:sz w:val="17"/>
               </w:rPr>
-              <w:t>Consolidation &amp; review</w:t>
+              <w:t>Consolidation &amp; literature synthesis</w:t>
             </w:r>
           </w:p>
         </w:tc>
         <w:tc>
           <w:tcPr>
-            <w:tcW w:type="dxa" w:w="4464"/>
+            <w:tcW w:type="dxa" w:w="4320"/>
           </w:tcPr>
           <w:p>
             <w:r/>
@@ -2507,7 +1929,7 @@
                 <w:rFonts w:ascii="Calibri" w:hAnsi="Calibri"/>
                 <w:sz w:val="17"/>
               </w:rPr>
-              <w:t>Critical literature review; benchmark vs CORMIX/VISJET; harden the verified baseline</w:t>
+              <w:t>Critical review; benchmark against CORMIX/VISJET; refine model formulation and self-test suite</w:t>
             </w:r>
           </w:p>
         </w:tc>
@@ -2522,7 +1944,7 @@
                 <w:rFonts w:ascii="Calibri" w:hAnsi="Calibri"/>
                 <w:sz w:val="17"/>
               </w:rPr>
-              <w:t>Review paper</w:t>
+              <w:t>Review paper; verified baseline</w:t>
             </w:r>
           </w:p>
         </w:tc>
@@ -2545,7 +1967,7 @@
         </w:tc>
         <w:tc>
           <w:tcPr>
-            <w:tcW w:type="dxa" w:w="2016"/>
+            <w:tcW w:type="dxa" w:w="2160"/>
           </w:tcPr>
           <w:p>
             <w:r/>
@@ -2560,7 +1982,7 @@
         </w:tc>
         <w:tc>
           <w:tcPr>
-            <w:tcW w:type="dxa" w:w="4464"/>
+            <w:tcW w:type="dxa" w:w="4320"/>
           </w:tcPr>
           <w:p>
             <w:r/>
@@ -2569,7 +1991,7 @@
                 <w:rFonts w:ascii="Calibri" w:hAnsi="Calibri"/>
                 <w:sz w:val="17"/>
               </w:rPr>
-              <w:t>Non-Boussinesq projection; multi-ion Maxwell–Stefan chemistry; 2nd-order time; conservative free surface; method-of-manufactured-solutions verification</w:t>
+              <w:t>Non-Boussinesq variable-density projection; multi-ion (Maxwell–Stefan) chemistry; 2nd-order time integration; conservative free surface</w:t>
             </w:r>
           </w:p>
         </w:tc>
@@ -2607,7 +2029,7 @@
         </w:tc>
         <w:tc>
           <w:tcPr>
-            <w:tcW w:type="dxa" w:w="2016"/>
+            <w:tcW w:type="dxa" w:w="2160"/>
           </w:tcPr>
           <w:p>
             <w:r/>
@@ -2622,7 +2044,7 @@
         </w:tc>
         <w:tc>
           <w:tcPr>
-            <w:tcW w:type="dxa" w:w="4464"/>
+            <w:tcW w:type="dxa" w:w="4320"/>
           </w:tcPr>
           <w:p>
             <w:r/>
@@ -2631,7 +2053,7 @@
                 <w:rFonts w:ascii="Calibri" w:hAnsi="Calibri"/>
                 <w:sz w:val="17"/>
               </w:rPr>
-              <w:t>Survey design; CTD/ADCP/towed campaign at an operating outfall; calibration; near- &amp; far-field validation; envelope coverage test</w:t>
+              <w:t>Design &amp; execute CTD/ADCP/towed-sensor survey at an operating outfall; calibrate; validate near &amp; far field and the uncertainty envelope</w:t>
             </w:r>
           </w:p>
         </w:tc>
@@ -2646,7 +2068,7 @@
                 <w:rFonts w:ascii="Calibri" w:hAnsi="Calibri"/>
                 <w:sz w:val="17"/>
               </w:rPr>
-              <w:t>Validation dataset; flagship paper</w:t>
+              <w:t>Validation dataset; key paper</w:t>
             </w:r>
           </w:p>
         </w:tc>
@@ -2669,7 +2091,7 @@
         </w:tc>
         <w:tc>
           <w:tcPr>
-            <w:tcW w:type="dxa" w:w="2016"/>
+            <w:tcW w:type="dxa" w:w="2160"/>
           </w:tcPr>
           <w:p>
             <w:r/>
@@ -2678,13 +2100,13 @@
                 <w:rFonts w:ascii="Calibri" w:hAnsi="Calibri"/>
                 <w:sz w:val="17"/>
               </w:rPr>
-              <w:t>UQ &amp; ML surrogate</w:t>
+              <w:t>Uncertainty &amp; ML surrogate</w:t>
             </w:r>
           </w:p>
         </w:tc>
         <w:tc>
           <w:tcPr>
-            <w:tcW w:type="dxa" w:w="4464"/>
+            <w:tcW w:type="dxa" w:w="4320"/>
           </w:tcPr>
           <w:p>
             <w:r/>
@@ -2693,7 +2115,7 @@
                 <w:rFonts w:ascii="Calibri" w:hAnsi="Calibri"/>
                 <w:sz w:val="17"/>
               </w:rPr>
-              <w:t>Polynomial-chaos / neural surrogate; Sobol sensitivity; efficient probabilistic screening</w:t>
+              <w:t>Polynomial-chaos / neural surrogate for rapid probabilistic screening; sensitivity (Sobol) analysis</w:t>
             </w:r>
           </w:p>
         </w:tc>
@@ -2708,7 +2130,7 @@
                 <w:rFonts w:ascii="Calibri" w:hAnsi="Calibri"/>
                 <w:sz w:val="17"/>
               </w:rPr>
-              <w:t>Surrogate; UQ paper</w:t>
+              <w:t>Surrogate tool; UQ paper</w:t>
             </w:r>
           </w:p>
         </w:tc>
@@ -2731,7 +2153,7 @@
         </w:tc>
         <w:tc>
           <w:tcPr>
-            <w:tcW w:type="dxa" w:w="2016"/>
+            <w:tcW w:type="dxa" w:w="2160"/>
           </w:tcPr>
           <w:p>
             <w:r/>
@@ -2740,13 +2162,13 @@
                 <w:rFonts w:ascii="Calibri" w:hAnsi="Calibri"/>
                 <w:sz w:val="17"/>
               </w:rPr>
-              <w:t>Application &amp; tool</w:t>
+              <w:t>Application &amp; tool release</w:t>
             </w:r>
           </w:p>
         </w:tc>
         <w:tc>
           <w:tcPr>
-            <w:tcW w:type="dxa" w:w="4464"/>
+            <w:tcW w:type="dxa" w:w="4320"/>
           </w:tcPr>
           <w:p>
             <w:r/>
@@ -2755,7 +2177,7 @@
                 <w:rFonts w:ascii="Calibri" w:hAnsi="Calibri"/>
                 <w:sz w:val="17"/>
               </w:rPr>
-              <w:t>Design/consenting case studies; open decision-support release; diffuser-design guidance</w:t>
+              <w:t>Design/consenting case studies (multiport, stratified, energetic sites); open decision-support release; guidance</w:t>
             </w:r>
           </w:p>
         </w:tc>
@@ -2793,7 +2215,7 @@
         </w:tc>
         <w:tc>
           <w:tcPr>
-            <w:tcW w:type="dxa" w:w="2016"/>
+            <w:tcW w:type="dxa" w:w="2160"/>
           </w:tcPr>
           <w:p>
             <w:r/>
@@ -2808,7 +2230,7 @@
         </w:tc>
         <w:tc>
           <w:tcPr>
-            <w:tcW w:type="dxa" w:w="4464"/>
+            <w:tcW w:type="dxa" w:w="4320"/>
           </w:tcPr>
           <w:p>
             <w:r/>
@@ -2817,7 +2239,7 @@
                 <w:rFonts w:ascii="Calibri" w:hAnsi="Calibri"/>
                 <w:sz w:val="17"/>
               </w:rPr>
-              <w:t>Integration; dissemination; thesis</w:t>
+              <w:t>Integration, dissemination, thesis writing</w:t>
             </w:r>
           </w:p>
         </w:tc>
@@ -2832,7 +2254,7 @@
                 <w:rFonts w:ascii="Calibri" w:hAnsi="Calibri"/>
                 <w:sz w:val="17"/>
               </w:rPr>
-              <w:t>Thesis; 4–6 papers</w:t>
+              <w:t>PhD thesis; 4–6 papers</w:t>
             </w:r>
           </w:p>
         </w:tc>
@@ -2840,10 +2262,16 @@
     </w:tbl>
     <w:p>
       <w:pPr>
-        <w:pStyle w:val="Heading2"/>
+        <w:spacing w:after="80"/>
       </w:pPr>
       <w:r>
-        <w:t>5.2 Timeline (Gantt)</w:t>
+        <w:rPr>
+          <w:rFonts w:ascii="Calibri" w:hAnsi="Calibri"/>
+          <w:b w:val="0"/>
+          <w:i w:val="0"/>
+          <w:sz w:val="22"/>
+        </w:rPr>
+        <w:t>Indicative timeline (●= active):</w:t>
       </w:r>
     </w:p>
     <w:tbl>
@@ -2866,7 +2294,7 @@
       <w:tr>
         <w:tc>
           <w:tcPr>
-            <w:tcW w:type="dxa" w:w="2880"/>
+            <w:tcW w:type="dxa" w:w="3168"/>
             <w:shd w:val="clear" w:color="auto" w:fill="1F4E79"/>
           </w:tcPr>
           <w:p>
@@ -2896,7 +2324,7 @@
                 <w:color w:val="FFFFFF"/>
                 <w:sz w:val="17"/>
               </w:rPr>
-              <w:t>Y1H1</w:t>
+              <w:t>Y1 H1</w:t>
             </w:r>
           </w:p>
         </w:tc>
@@ -2914,7 +2342,7 @@
                 <w:color w:val="FFFFFF"/>
                 <w:sz w:val="17"/>
               </w:rPr>
-              <w:t>Y1H2</w:t>
+              <w:t>Y1 H2</w:t>
             </w:r>
           </w:p>
         </w:tc>
@@ -2932,7 +2360,7 @@
                 <w:color w:val="FFFFFF"/>
                 <w:sz w:val="17"/>
               </w:rPr>
-              <w:t>Y2H1</w:t>
+              <w:t>Y2 H1</w:t>
             </w:r>
           </w:p>
         </w:tc>
@@ -2950,7 +2378,7 @@
                 <w:color w:val="FFFFFF"/>
                 <w:sz w:val="17"/>
               </w:rPr>
-              <w:t>Y2H2</w:t>
+              <w:t>Y2 H2</w:t>
             </w:r>
           </w:p>
         </w:tc>
@@ -2968,7 +2396,7 @@
                 <w:color w:val="FFFFFF"/>
                 <w:sz w:val="17"/>
               </w:rPr>
-              <w:t>Y3H1</w:t>
+              <w:t>Y3 H1</w:t>
             </w:r>
           </w:p>
         </w:tc>
@@ -2986,7 +2414,7 @@
                 <w:color w:val="FFFFFF"/>
                 <w:sz w:val="17"/>
               </w:rPr>
-              <w:t>Y3H2</w:t>
+              <w:t>Y3 H2</w:t>
             </w:r>
           </w:p>
         </w:tc>
@@ -3004,7 +2432,7 @@
                 <w:color w:val="FFFFFF"/>
                 <w:sz w:val="17"/>
               </w:rPr>
-              <w:t>Y4H1</w:t>
+              <w:t>Y4 H1</w:t>
             </w:r>
           </w:p>
         </w:tc>
@@ -3012,7 +2440,7 @@
       <w:tr>
         <w:tc>
           <w:tcPr>
-            <w:tcW w:type="dxa" w:w="2880"/>
+            <w:tcW w:type="dxa" w:w="3168"/>
           </w:tcPr>
           <w:p>
             <w:r/>
@@ -3129,7 +2557,7 @@
       <w:tr>
         <w:tc>
           <w:tcPr>
-            <w:tcW w:type="dxa" w:w="2880"/>
+            <w:tcW w:type="dxa" w:w="3168"/>
           </w:tcPr>
           <w:p>
             <w:r/>
@@ -3247,7 +2675,7 @@
       <w:tr>
         <w:tc>
           <w:tcPr>
-            <w:tcW w:type="dxa" w:w="2880"/>
+            <w:tcW w:type="dxa" w:w="3168"/>
           </w:tcPr>
           <w:p>
             <w:r/>
@@ -3365,7 +2793,7 @@
       <w:tr>
         <w:tc>
           <w:tcPr>
-            <w:tcW w:type="dxa" w:w="2880"/>
+            <w:tcW w:type="dxa" w:w="3168"/>
           </w:tcPr>
           <w:p>
             <w:r/>
@@ -3483,7 +2911,7 @@
       <w:tr>
         <w:tc>
           <w:tcPr>
-            <w:tcW w:type="dxa" w:w="2880"/>
+            <w:tcW w:type="dxa" w:w="3168"/>
           </w:tcPr>
           <w:p>
             <w:r/>
@@ -3601,7 +3029,7 @@
       <w:tr>
         <w:tc>
           <w:tcPr>
-            <w:tcW w:type="dxa" w:w="2880"/>
+            <w:tcW w:type="dxa" w:w="3168"/>
           </w:tcPr>
           <w:p>
             <w:r/>
@@ -3718,10 +3146,105 @@
     </w:tbl>
     <w:p>
       <w:pPr>
-        <w:pStyle w:val="Heading2"/>
+        <w:pStyle w:val="Heading1"/>
       </w:pPr>
       <w:r>
-        <w:t>5.3 Milestones and deliverables</w:t>
+        <w:t>9. Expected Outcomes, Deliverables and Publications</w:t>
+      </w:r>
+    </w:p>
+    <w:p>
+      <w:pPr>
+        <w:pStyle w:val="ListBullet"/>
+        <w:spacing w:after="40"/>
+      </w:pPr>
+      <w:r>
+        <w:rPr>
+          <w:rFonts w:ascii="Calibri" w:hAnsi="Calibri"/>
+          <w:sz w:val="22"/>
+        </w:rPr>
+        <w:t>A validated, uncertainty-aware coupled-PDE framework for brine-outfall salinity prediction, with an extended (non-Boussinesq, multi-ion) physics core.</w:t>
+      </w:r>
+    </w:p>
+    <w:p>
+      <w:pPr>
+        <w:pStyle w:val="ListBullet"/>
+        <w:spacing w:after="40"/>
+      </w:pPr>
+      <w:r>
+        <w:rPr>
+          <w:rFonts w:ascii="Calibri" w:hAnsi="Calibri"/>
+          <w:sz w:val="22"/>
+        </w:rPr>
+        <w:t>The first field-validated near-field/far-field stochastic coupling for dense effluent dispersion, with a published validation dataset.</w:t>
+      </w:r>
+    </w:p>
+    <w:p>
+      <w:pPr>
+        <w:pStyle w:val="ListBullet"/>
+        <w:spacing w:after="40"/>
+      </w:pPr>
+      <w:r>
+        <w:rPr>
+          <w:rFonts w:ascii="Calibri" w:hAnsi="Calibri"/>
+          <w:sz w:val="22"/>
+        </w:rPr>
+        <w:t>A fast machine-learning surrogate enabling probabilistic compliance screening in design workflows.</w:t>
+      </w:r>
+    </w:p>
+    <w:p>
+      <w:pPr>
+        <w:pStyle w:val="ListBullet"/>
+        <w:spacing w:after="40"/>
+      </w:pPr>
+      <w:r>
+        <w:rPr>
+          <w:rFonts w:ascii="Calibri" w:hAnsi="Calibri"/>
+          <w:sz w:val="22"/>
+        </w:rPr>
+        <w:t>An open, documented decision-support tool and design guidance on diffuser configuration (notably port spacing and jet merging).</w:t>
+      </w:r>
+    </w:p>
+    <w:p>
+      <w:pPr>
+        <w:pStyle w:val="ListBullet"/>
+        <w:spacing w:after="40"/>
+      </w:pPr>
+      <w:r>
+        <w:rPr>
+          <w:rFonts w:ascii="Calibri" w:hAnsi="Calibri"/>
+          <w:sz w:val="22"/>
+        </w:rPr>
+        <w:t>4–6 peer-reviewed journal papers and a PhD thesis.</w:t>
+      </w:r>
+    </w:p>
+    <w:p>
+      <w:pPr>
+        <w:pStyle w:val="Heading1"/>
+      </w:pPr>
+      <w:r>
+        <w:t>10. Significance and Impact</w:t>
+      </w:r>
+    </w:p>
+    <w:p>
+      <w:pPr>
+        <w:spacing w:after="120"/>
+      </w:pPr>
+      <w:r>
+        <w:rPr>
+          <w:rFonts w:ascii="Calibri" w:hAnsi="Calibri"/>
+          <w:b w:val="0"/>
+          <w:i w:val="0"/>
+          <w:sz w:val="22"/>
+        </w:rPr>
+        <w:t>Scientifically, the project advances environmental fluid mechanics by delivering a validated coupled stochastic-PDE treatment of dense effluent dispersion with quantified uncertainty. Practically, it equips desalination engineers and marine regulators with a more complete, risk-based predictive capability — supporting outfall design that minimises ecological impact and evidence-based consenting. Given the rapid global growth of desalination and tightening marine-protection regimes, the impact is timely and international.</w:t>
+      </w:r>
+    </w:p>
+    <w:p>
+      <w:pPr>
+        <w:pStyle w:val="Heading1"/>
+      </w:pPr>
+      <w:r>
+        <w:t>11. Risk Management and Contingency</w:t>
       </w:r>
     </w:p>
     <w:tbl>
@@ -3739,631 +3262,7 @@
       <w:tr>
         <w:tc>
           <w:tcPr>
-            <w:tcW w:type="dxa" w:w="3312"/>
-            <w:shd w:val="clear" w:color="auto" w:fill="1F4E79"/>
-          </w:tcPr>
-          <w:p>
-            <w:r/>
-            <w:r>
-              <w:rPr>
-                <w:rFonts w:ascii="Calibri" w:hAnsi="Calibri"/>
-                <w:b/>
-                <w:color w:val="FFFFFF"/>
-                <w:sz w:val="18"/>
-              </w:rPr>
-              <w:t>Milestone</w:t>
-            </w:r>
-          </w:p>
-        </w:tc>
-        <w:tc>
-          <w:tcPr>
-            <w:tcW w:type="dxa" w:w="1440"/>
-            <w:shd w:val="clear" w:color="auto" w:fill="1F4E79"/>
-          </w:tcPr>
-          <w:p>
-            <w:r/>
-            <w:r>
-              <w:rPr>
-                <w:rFonts w:ascii="Calibri" w:hAnsi="Calibri"/>
-                <w:b/>
-                <w:color w:val="FFFFFF"/>
-                <w:sz w:val="18"/>
-              </w:rPr>
-              <w:t>When</w:t>
-            </w:r>
-          </w:p>
-        </w:tc>
-        <w:tc>
-          <w:tcPr>
-            <w:tcW w:type="dxa" w:w="4176"/>
-            <w:shd w:val="clear" w:color="auto" w:fill="1F4E79"/>
-          </w:tcPr>
-          <w:p>
-            <w:r/>
-            <w:r>
-              <w:rPr>
-                <w:rFonts w:ascii="Calibri" w:hAnsi="Calibri"/>
-                <w:b/>
-                <w:color w:val="FFFFFF"/>
-                <w:sz w:val="18"/>
-              </w:rPr>
-              <w:t>Deliverable</w:t>
-            </w:r>
-          </w:p>
-        </w:tc>
-      </w:tr>
-      <w:tr>
-        <w:tc>
-          <w:tcPr>
-            <w:tcW w:type="dxa" w:w="3312"/>
-          </w:tcPr>
-          <w:p>
-            <w:r/>
-            <w:r>
-              <w:rPr>
-                <w:rFonts w:ascii="Calibri" w:hAnsi="Calibri"/>
-                <w:sz w:val="18"/>
-              </w:rPr>
-              <w:t>M1 Verified baseline &amp; review</w:t>
-            </w:r>
-          </w:p>
-        </w:tc>
-        <w:tc>
-          <w:tcPr>
-            <w:tcW w:type="dxa" w:w="1440"/>
-          </w:tcPr>
-          <w:p>
-            <w:r/>
-            <w:r>
-              <w:rPr>
-                <w:rFonts w:ascii="Calibri" w:hAnsi="Calibri"/>
-                <w:sz w:val="18"/>
-              </w:rPr>
-              <w:t>Month 9</w:t>
-            </w:r>
-          </w:p>
-        </w:tc>
-        <w:tc>
-          <w:tcPr>
-            <w:tcW w:type="dxa" w:w="4176"/>
-          </w:tcPr>
-          <w:p>
-            <w:r/>
-            <w:r>
-              <w:rPr>
-                <w:rFonts w:ascii="Calibri" w:hAnsi="Calibri"/>
-                <w:sz w:val="18"/>
-              </w:rPr>
-              <w:t>Review paper submitted</w:t>
-            </w:r>
-          </w:p>
-        </w:tc>
-      </w:tr>
-      <w:tr>
-        <w:tc>
-          <w:tcPr>
-            <w:tcW w:type="dxa" w:w="3312"/>
-          </w:tcPr>
-          <w:p>
-            <w:r/>
-            <w:r>
-              <w:rPr>
-                <w:rFonts w:ascii="Calibri" w:hAnsi="Calibri"/>
-                <w:sz w:val="18"/>
-              </w:rPr>
-              <w:t>M2 Extended physics solver</w:t>
-            </w:r>
-          </w:p>
-        </w:tc>
-        <w:tc>
-          <w:tcPr>
-            <w:tcW w:type="dxa" w:w="1440"/>
-          </w:tcPr>
-          <w:p>
-            <w:r/>
-            <w:r>
-              <w:rPr>
-                <w:rFonts w:ascii="Calibri" w:hAnsi="Calibri"/>
-                <w:sz w:val="18"/>
-              </w:rPr>
-              <w:t>Month 21</w:t>
-            </w:r>
-          </w:p>
-        </w:tc>
-        <w:tc>
-          <w:tcPr>
-            <w:tcW w:type="dxa" w:w="4176"/>
-          </w:tcPr>
-          <w:p>
-            <w:r/>
-            <w:r>
-              <w:rPr>
-                <w:rFonts w:ascii="Calibri" w:hAnsi="Calibri"/>
-                <w:sz w:val="18"/>
-              </w:rPr>
-              <w:t>Methods paper; released code</w:t>
-            </w:r>
-          </w:p>
-        </w:tc>
-      </w:tr>
-      <w:tr>
-        <w:tc>
-          <w:tcPr>
-            <w:tcW w:type="dxa" w:w="3312"/>
-          </w:tcPr>
-          <w:p>
-            <w:r/>
-            <w:r>
-              <w:rPr>
-                <w:rFonts w:ascii="Calibri" w:hAnsi="Calibri"/>
-                <w:sz w:val="18"/>
-              </w:rPr>
-              <w:t>M3 Field campaign complete</w:t>
-            </w:r>
-          </w:p>
-        </w:tc>
-        <w:tc>
-          <w:tcPr>
-            <w:tcW w:type="dxa" w:w="1440"/>
-          </w:tcPr>
-          <w:p>
-            <w:r/>
-            <w:r>
-              <w:rPr>
-                <w:rFonts w:ascii="Calibri" w:hAnsi="Calibri"/>
-                <w:sz w:val="18"/>
-              </w:rPr>
-              <w:t>Month 30</w:t>
-            </w:r>
-          </w:p>
-        </w:tc>
-        <w:tc>
-          <w:tcPr>
-            <w:tcW w:type="dxa" w:w="4176"/>
-          </w:tcPr>
-          <w:p>
-            <w:r/>
-            <w:r>
-              <w:rPr>
-                <w:rFonts w:ascii="Calibri" w:hAnsi="Calibri"/>
-                <w:sz w:val="18"/>
-              </w:rPr>
-              <w:t>Validation dataset</w:t>
-            </w:r>
-          </w:p>
-        </w:tc>
-      </w:tr>
-      <w:tr>
-        <w:tc>
-          <w:tcPr>
-            <w:tcW w:type="dxa" w:w="3312"/>
-          </w:tcPr>
-          <w:p>
-            <w:r/>
-            <w:r>
-              <w:rPr>
-                <w:rFonts w:ascii="Calibri" w:hAnsi="Calibri"/>
-                <w:sz w:val="18"/>
-              </w:rPr>
-              <w:t>M4 Validation paper</w:t>
-            </w:r>
-          </w:p>
-        </w:tc>
-        <w:tc>
-          <w:tcPr>
-            <w:tcW w:type="dxa" w:w="1440"/>
-          </w:tcPr>
-          <w:p>
-            <w:r/>
-            <w:r>
-              <w:rPr>
-                <w:rFonts w:ascii="Calibri" w:hAnsi="Calibri"/>
-                <w:sz w:val="18"/>
-              </w:rPr>
-              <w:t>Month 36</w:t>
-            </w:r>
-          </w:p>
-        </w:tc>
-        <w:tc>
-          <w:tcPr>
-            <w:tcW w:type="dxa" w:w="4176"/>
-          </w:tcPr>
-          <w:p>
-            <w:r/>
-            <w:r>
-              <w:rPr>
-                <w:rFonts w:ascii="Calibri" w:hAnsi="Calibri"/>
-                <w:sz w:val="18"/>
-              </w:rPr>
-              <w:t>Flagship journal paper</w:t>
-            </w:r>
-          </w:p>
-        </w:tc>
-      </w:tr>
-      <w:tr>
-        <w:tc>
-          <w:tcPr>
-            <w:tcW w:type="dxa" w:w="3312"/>
-          </w:tcPr>
-          <w:p>
-            <w:r/>
-            <w:r>
-              <w:rPr>
-                <w:rFonts w:ascii="Calibri" w:hAnsi="Calibri"/>
-                <w:sz w:val="18"/>
-              </w:rPr>
-              <w:t>M5 Surrogate &amp; UQ</w:t>
-            </w:r>
-          </w:p>
-        </w:tc>
-        <w:tc>
-          <w:tcPr>
-            <w:tcW w:type="dxa" w:w="1440"/>
-          </w:tcPr>
-          <w:p>
-            <w:r/>
-            <w:r>
-              <w:rPr>
-                <w:rFonts w:ascii="Calibri" w:hAnsi="Calibri"/>
-                <w:sz w:val="18"/>
-              </w:rPr>
-              <w:t>Month 39</w:t>
-            </w:r>
-          </w:p>
-        </w:tc>
-        <w:tc>
-          <w:tcPr>
-            <w:tcW w:type="dxa" w:w="4176"/>
-          </w:tcPr>
-          <w:p>
-            <w:r/>
-            <w:r>
-              <w:rPr>
-                <w:rFonts w:ascii="Calibri" w:hAnsi="Calibri"/>
-                <w:sz w:val="18"/>
-              </w:rPr>
-              <w:t>Surrogate tool; UQ paper</w:t>
-            </w:r>
-          </w:p>
-        </w:tc>
-      </w:tr>
-      <w:tr>
-        <w:tc>
-          <w:tcPr>
-            <w:tcW w:type="dxa" w:w="3312"/>
-          </w:tcPr>
-          <w:p>
-            <w:r/>
-            <w:r>
-              <w:rPr>
-                <w:rFonts w:ascii="Calibri" w:hAnsi="Calibri"/>
-                <w:sz w:val="18"/>
-              </w:rPr>
-              <w:t>M6 Tool release &amp; thesis</w:t>
-            </w:r>
-          </w:p>
-        </w:tc>
-        <w:tc>
-          <w:tcPr>
-            <w:tcW w:type="dxa" w:w="1440"/>
-          </w:tcPr>
-          <w:p>
-            <w:r/>
-            <w:r>
-              <w:rPr>
-                <w:rFonts w:ascii="Calibri" w:hAnsi="Calibri"/>
-                <w:sz w:val="18"/>
-              </w:rPr>
-              <w:t>Month 45</w:t>
-            </w:r>
-          </w:p>
-        </w:tc>
-        <w:tc>
-          <w:tcPr>
-            <w:tcW w:type="dxa" w:w="4176"/>
-          </w:tcPr>
-          <w:p>
-            <w:r/>
-            <w:r>
-              <w:rPr>
-                <w:rFonts w:ascii="Calibri" w:hAnsi="Calibri"/>
-                <w:sz w:val="18"/>
-              </w:rPr>
-              <w:t>Open tool; PhD thesis</w:t>
-            </w:r>
-          </w:p>
-        </w:tc>
-      </w:tr>
-    </w:tbl>
-    <w:p>
-      <w:pPr>
-        <w:pStyle w:val="Heading2"/>
-      </w:pPr>
-      <w:r>
-        <w:t>5.4 Training and development plan</w:t>
-      </w:r>
-    </w:p>
-    <w:p>
-      <w:pPr>
-        <w:pStyle w:val="ListBullet"/>
-        <w:spacing w:after="40"/>
-      </w:pPr>
-      <w:r>
-        <w:rPr>
-          <w:rFonts w:ascii="Calibri" w:hAnsi="Calibri"/>
-          <w:sz w:val="22"/>
-        </w:rPr>
-        <w:t>Technical: advanced CFD/numerical methods, stochastic modelling and UQ, machine learning, oceanographic field methods and instrumentation.</w:t>
-      </w:r>
-    </w:p>
-    <w:p>
-      <w:pPr>
-        <w:pStyle w:val="ListBullet"/>
-        <w:spacing w:after="40"/>
-      </w:pPr>
-      <w:r>
-        <w:rPr>
-          <w:rFonts w:ascii="Calibri" w:hAnsi="Calibri"/>
-          <w:sz w:val="22"/>
-        </w:rPr>
-        <w:t>Transferable: scientific writing, open-source software engineering, data management, project and stakeholder management.</w:t>
-      </w:r>
-    </w:p>
-    <w:p>
-      <w:pPr>
-        <w:pStyle w:val="ListBullet"/>
-        <w:spacing w:after="40"/>
-      </w:pPr>
-      <w:r>
-        <w:rPr>
-          <w:rFonts w:ascii="Calibri" w:hAnsi="Calibri"/>
-          <w:sz w:val="22"/>
-        </w:rPr>
-        <w:t>Dissemination: international conferences (e.g. IAHR, IDA World Congress, EGU) and engagement with industry and regulators.</w:t>
-      </w:r>
-    </w:p>
-    <w:p>
-      <w:pPr>
-        <w:pStyle w:val="Heading2"/>
-      </w:pPr>
-      <w:r>
-        <w:t>5.5 Indicative resources and budget</w:t>
-      </w:r>
-    </w:p>
-    <w:tbl>
-      <w:tblPr>
-        <w:tblStyle w:val="LightGrid-Accent1"/>
-        <w:tblW w:type="auto" w:w="0"/>
-        <w:jc w:val="center"/>
-        <w:tblLook w:firstColumn="1" w:firstRow="1" w:lastColumn="0" w:lastRow="0" w:noHBand="0" w:noVBand="1" w:val="04A0"/>
-      </w:tblPr>
-      <w:tblGrid>
-        <w:gridCol w:w="4320"/>
-        <w:gridCol w:w="4320"/>
-      </w:tblGrid>
-      <w:tr>
-        <w:tc>
-          <w:tcPr>
-            <w:tcW w:type="dxa" w:w="2592"/>
-            <w:shd w:val="clear" w:color="auto" w:fill="1F4E79"/>
-          </w:tcPr>
-          <w:p>
-            <w:r/>
-            <w:r>
-              <w:rPr>
-                <w:rFonts w:ascii="Calibri" w:hAnsi="Calibri"/>
-                <w:b/>
-                <w:color w:val="FFFFFF"/>
-                <w:sz w:val="18"/>
-              </w:rPr>
-              <w:t>Item</w:t>
-            </w:r>
-          </w:p>
-        </w:tc>
-        <w:tc>
-          <w:tcPr>
-            <w:tcW w:type="dxa" w:w="6336"/>
-            <w:shd w:val="clear" w:color="auto" w:fill="1F4E79"/>
-          </w:tcPr>
-          <w:p>
-            <w:r/>
-            <w:r>
-              <w:rPr>
-                <w:rFonts w:ascii="Calibri" w:hAnsi="Calibri"/>
-                <w:b/>
-                <w:color w:val="FFFFFF"/>
-                <w:sz w:val="18"/>
-              </w:rPr>
-              <w:t>Indicative provision</w:t>
-            </w:r>
-          </w:p>
-        </w:tc>
-      </w:tr>
-      <w:tr>
-        <w:tc>
-          <w:tcPr>
-            <w:tcW w:type="dxa" w:w="2592"/>
-          </w:tcPr>
-          <w:p>
-            <w:r/>
-            <w:r>
-              <w:rPr>
-                <w:rFonts w:ascii="Calibri" w:hAnsi="Calibri"/>
-                <w:sz w:val="18"/>
-              </w:rPr>
-              <w:t>HPC / compute</w:t>
-            </w:r>
-          </w:p>
-        </w:tc>
-        <w:tc>
-          <w:tcPr>
-            <w:tcW w:type="dxa" w:w="6336"/>
-          </w:tcPr>
-          <w:p>
-            <w:r/>
-            <w:r>
-              <w:rPr>
-                <w:rFonts w:ascii="Calibri" w:hAnsi="Calibri"/>
-                <w:sz w:val="18"/>
-              </w:rPr>
-              <w:t>Ensemble simulations; cloud or institutional cluster allocation</w:t>
-            </w:r>
-          </w:p>
-        </w:tc>
-      </w:tr>
-      <w:tr>
-        <w:tc>
-          <w:tcPr>
-            <w:tcW w:type="dxa" w:w="2592"/>
-          </w:tcPr>
-          <w:p>
-            <w:r/>
-            <w:r>
-              <w:rPr>
-                <w:rFonts w:ascii="Calibri" w:hAnsi="Calibri"/>
-                <w:sz w:val="18"/>
-              </w:rPr>
-              <w:t>Field campaign</w:t>
-            </w:r>
-          </w:p>
-        </w:tc>
-        <w:tc>
-          <w:tcPr>
-            <w:tcW w:type="dxa" w:w="6336"/>
-          </w:tcPr>
-          <w:p>
-            <w:r/>
-            <w:r>
-              <w:rPr>
-                <w:rFonts w:ascii="Calibri" w:hAnsi="Calibri"/>
-                <w:sz w:val="18"/>
-              </w:rPr>
-              <w:t>Vessel time; CTD, ADCP, towed conductivity sensor; consumables</w:t>
-            </w:r>
-          </w:p>
-        </w:tc>
-      </w:tr>
-      <w:tr>
-        <w:tc>
-          <w:tcPr>
-            <w:tcW w:type="dxa" w:w="2592"/>
-          </w:tcPr>
-          <w:p>
-            <w:r/>
-            <w:r>
-              <w:rPr>
-                <w:rFonts w:ascii="Calibri" w:hAnsi="Calibri"/>
-                <w:sz w:val="18"/>
-              </w:rPr>
-              <w:t>Travel</w:t>
-            </w:r>
-          </w:p>
-        </w:tc>
-        <w:tc>
-          <w:tcPr>
-            <w:tcW w:type="dxa" w:w="6336"/>
-          </w:tcPr>
-          <w:p>
-            <w:r/>
-            <w:r>
-              <w:rPr>
-                <w:rFonts w:ascii="Calibri" w:hAnsi="Calibri"/>
-                <w:sz w:val="18"/>
-              </w:rPr>
-              <w:t>Conferences; field site visits</w:t>
-            </w:r>
-          </w:p>
-        </w:tc>
-      </w:tr>
-      <w:tr>
-        <w:tc>
-          <w:tcPr>
-            <w:tcW w:type="dxa" w:w="2592"/>
-          </w:tcPr>
-          <w:p>
-            <w:r/>
-            <w:r>
-              <w:rPr>
-                <w:rFonts w:ascii="Calibri" w:hAnsi="Calibri"/>
-                <w:sz w:val="18"/>
-              </w:rPr>
-              <w:t>Partnerships</w:t>
-            </w:r>
-          </w:p>
-        </w:tc>
-        <w:tc>
-          <w:tcPr>
-            <w:tcW w:type="dxa" w:w="6336"/>
-          </w:tcPr>
-          <w:p>
-            <w:r/>
-            <w:r>
-              <w:rPr>
-                <w:rFonts w:ascii="Calibri" w:hAnsi="Calibri"/>
-                <w:sz w:val="18"/>
-              </w:rPr>
-              <w:t>Plant operator (site access, plant data); environmental regulator</w:t>
-            </w:r>
-          </w:p>
-        </w:tc>
-      </w:tr>
-      <w:tr>
-        <w:tc>
-          <w:tcPr>
-            <w:tcW w:type="dxa" w:w="2592"/>
-          </w:tcPr>
-          <w:p>
-            <w:r/>
-            <w:r>
-              <w:rPr>
-                <w:rFonts w:ascii="Calibri" w:hAnsi="Calibri"/>
-                <w:sz w:val="18"/>
-              </w:rPr>
-              <w:t>Software</w:t>
-            </w:r>
-          </w:p>
-        </w:tc>
-        <w:tc>
-          <w:tcPr>
-            <w:tcW w:type="dxa" w:w="6336"/>
-          </w:tcPr>
-          <w:p>
-            <w:r/>
-            <w:r>
-              <w:rPr>
-                <w:rFonts w:ascii="Calibri" w:hAnsi="Calibri"/>
-                <w:sz w:val="18"/>
-              </w:rPr>
-              <w:t>Open-source toolchain (no licence cost)</w:t>
-            </w:r>
-          </w:p>
-        </w:tc>
-      </w:tr>
-    </w:tbl>
-    <w:p>
-      <w:pPr>
-        <w:pStyle w:val="Heading2"/>
-      </w:pPr>
-      <w:r>
-        <w:t>5.6 Risk management</w:t>
-      </w:r>
-    </w:p>
-    <w:tbl>
-      <w:tblPr>
-        <w:tblStyle w:val="LightGrid-Accent1"/>
-        <w:tblW w:type="auto" w:w="0"/>
-        <w:jc w:val="center"/>
-        <w:tblLook w:firstColumn="1" w:firstRow="1" w:lastColumn="0" w:lastRow="0" w:noHBand="0" w:noVBand="1" w:val="04A0"/>
-      </w:tblPr>
-      <w:tblGrid>
-        <w:gridCol w:w="2880"/>
-        <w:gridCol w:w="2880"/>
-        <w:gridCol w:w="2880"/>
-      </w:tblGrid>
-      <w:tr>
-        <w:tc>
-          <w:tcPr>
-            <w:tcW w:type="dxa" w:w="3312"/>
+            <w:tcW w:type="dxa" w:w="3168"/>
             <w:shd w:val="clear" w:color="auto" w:fill="1F4E79"/>
           </w:tcPr>
           <w:p>
@@ -4381,7 +3280,7 @@
         </w:tc>
         <w:tc>
           <w:tcPr>
-            <w:tcW w:type="dxa" w:w="864"/>
+            <w:tcW w:type="dxa" w:w="1872"/>
             <w:shd w:val="clear" w:color="auto" w:fill="1F4E79"/>
           </w:tcPr>
           <w:p>
@@ -4393,13 +3292,13 @@
                 <w:color w:val="FFFFFF"/>
                 <w:sz w:val="17"/>
               </w:rPr>
-              <w:t>L/I</w:t>
+              <w:t>Likelihood / impact</w:t>
             </w:r>
           </w:p>
         </w:tc>
         <w:tc>
           <w:tcPr>
-            <w:tcW w:type="dxa" w:w="4752"/>
+            <w:tcW w:type="dxa" w:w="3888"/>
             <w:shd w:val="clear" w:color="auto" w:fill="1F4E79"/>
           </w:tcPr>
           <w:p>
@@ -4419,7 +3318,7 @@
       <w:tr>
         <w:tc>
           <w:tcPr>
-            <w:tcW w:type="dxa" w:w="3312"/>
+            <w:tcW w:type="dxa" w:w="3168"/>
           </w:tcPr>
           <w:p>
             <w:r/>
@@ -4428,13 +3327,13 @@
                 <w:rFonts w:ascii="Calibri" w:hAnsi="Calibri"/>
                 <w:sz w:val="17"/>
               </w:rPr>
-              <w:t>Field access / weather (WP3)</w:t>
+              <w:t>Field-survey access or weather constraints (WP3)</w:t>
             </w:r>
           </w:p>
         </w:tc>
         <w:tc>
           <w:tcPr>
-            <w:tcW w:type="dxa" w:w="864"/>
+            <w:tcW w:type="dxa" w:w="1872"/>
           </w:tcPr>
           <w:p>
             <w:r/>
@@ -4443,13 +3342,13 @@
                 <w:rFonts w:ascii="Calibri" w:hAnsi="Calibri"/>
                 <w:sz w:val="17"/>
               </w:rPr>
-              <w:t>M/H</w:t>
+              <w:t>Med / High</w:t>
             </w:r>
           </w:p>
         </w:tc>
         <w:tc>
           <w:tcPr>
-            <w:tcW w:type="dxa" w:w="4752"/>
+            <w:tcW w:type="dxa" w:w="3888"/>
           </w:tcPr>
           <w:p>
             <w:r/>
@@ -4458,7 +3357,7 @@
                 <w:rFonts w:ascii="Calibri" w:hAnsi="Calibri"/>
                 <w:sz w:val="17"/>
               </w:rPr>
-              <w:t>Multiple candidate sites; early operator partnership; existing monitoring data as fallback</w:t>
+              <w:t>Multiple candidate sites; partner with plant operators early; use existing monitoring datasets as fallback</w:t>
             </w:r>
           </w:p>
         </w:tc>
@@ -4466,7 +3365,7 @@
       <w:tr>
         <w:tc>
           <w:tcPr>
-            <w:tcW w:type="dxa" w:w="3312"/>
+            <w:tcW w:type="dxa" w:w="3168"/>
           </w:tcPr>
           <w:p>
             <w:r/>
@@ -4481,7 +3380,7 @@
         </w:tc>
         <w:tc>
           <w:tcPr>
-            <w:tcW w:type="dxa" w:w="864"/>
+            <w:tcW w:type="dxa" w:w="1872"/>
           </w:tcPr>
           <w:p>
             <w:r/>
@@ -4490,13 +3389,13 @@
                 <w:rFonts w:ascii="Calibri" w:hAnsi="Calibri"/>
                 <w:sz w:val="17"/>
               </w:rPr>
-              <w:t>M/M</w:t>
+              <w:t>Med / Med</w:t>
             </w:r>
           </w:p>
         </w:tc>
         <w:tc>
           <w:tcPr>
-            <w:tcW w:type="dxa" w:w="4752"/>
+            <w:tcW w:type="dxa" w:w="3888"/>
           </w:tcPr>
           <w:p>
             <w:r/>
@@ -4505,7 +3404,7 @@
                 <w:rFonts w:ascii="Calibri" w:hAnsi="Calibri"/>
                 <w:sz w:val="17"/>
               </w:rPr>
-              <w:t>Incremental development behind the verified Boussinesq-buoyancy baseline</w:t>
+              <w:t>Incremental development behind the verified baseline; retain stable Boussinesq-buoyancy default</w:t>
             </w:r>
           </w:p>
         </w:tc>
@@ -4513,7 +3412,7 @@
       <w:tr>
         <w:tc>
           <w:tcPr>
-            <w:tcW w:type="dxa" w:w="3312"/>
+            <w:tcW w:type="dxa" w:w="3168"/>
           </w:tcPr>
           <w:p>
             <w:r/>
@@ -4522,13 +3421,13 @@
                 <w:rFonts w:ascii="Calibri" w:hAnsi="Calibri"/>
                 <w:sz w:val="17"/>
               </w:rPr>
-              <w:t>Ensemble computational cost</w:t>
+              <w:t>Computational cost of ensembles</w:t>
             </w:r>
           </w:p>
         </w:tc>
         <w:tc>
           <w:tcPr>
-            <w:tcW w:type="dxa" w:w="864"/>
+            <w:tcW w:type="dxa" w:w="1872"/>
           </w:tcPr>
           <w:p>
             <w:r/>
@@ -4537,13 +3436,13 @@
                 <w:rFonts w:ascii="Calibri" w:hAnsi="Calibri"/>
                 <w:sz w:val="17"/>
               </w:rPr>
-              <w:t>M/M</w:t>
+              <w:t>Med / Med</w:t>
             </w:r>
           </w:p>
         </w:tc>
         <w:tc>
           <w:tcPr>
-            <w:tcW w:type="dxa" w:w="4752"/>
+            <w:tcW w:type="dxa" w:w="3888"/>
           </w:tcPr>
           <w:p>
             <w:r/>
@@ -4552,7 +3451,7 @@
                 <w:rFonts w:ascii="Calibri" w:hAnsi="Calibri"/>
                 <w:sz w:val="17"/>
               </w:rPr>
-              <w:t>ML surrogate; parallelisation</w:t>
+              <w:t>ML surrogate (WP4); parallelisation; reduced-order screening</w:t>
             </w:r>
           </w:p>
         </w:tc>
@@ -4560,7 +3459,7 @@
       <w:tr>
         <w:tc>
           <w:tcPr>
-            <w:tcW w:type="dxa" w:w="3312"/>
+            <w:tcW w:type="dxa" w:w="3168"/>
           </w:tcPr>
           <w:p>
             <w:r/>
@@ -4569,13 +3468,13 @@
                 <w:rFonts w:ascii="Calibri" w:hAnsi="Calibri"/>
                 <w:sz w:val="17"/>
               </w:rPr>
-              <w:t>Closure/merging-factor uncertainty</w:t>
+              <w:t>Merging-factor / closure uncertainty</w:t>
             </w:r>
           </w:p>
         </w:tc>
         <w:tc>
           <w:tcPr>
-            <w:tcW w:type="dxa" w:w="864"/>
+            <w:tcW w:type="dxa" w:w="1872"/>
           </w:tcPr>
           <w:p>
             <w:r/>
@@ -4584,13 +3483,13 @@
                 <w:rFonts w:ascii="Calibri" w:hAnsi="Calibri"/>
                 <w:sz w:val="17"/>
               </w:rPr>
-              <w:t>M/M</w:t>
+              <w:t>Med / Med</w:t>
             </w:r>
           </w:p>
         </w:tc>
         <w:tc>
           <w:tcPr>
-            <w:tcW w:type="dxa" w:w="4752"/>
+            <w:tcW w:type="dxa" w:w="3888"/>
           </w:tcPr>
           <w:p>
             <w:r/>
@@ -4599,7 +3498,7 @@
                 <w:rFonts w:ascii="Calibri" w:hAnsi="Calibri"/>
                 <w:sz w:val="17"/>
               </w:rPr>
-              <w:t>Calibrate to lab &amp; field; report bounded estimates</w:t>
+              <w:t>Calibrate against lab and field data; report as bounded estimate</w:t>
             </w:r>
           </w:p>
         </w:tc>
@@ -4607,10 +3506,10 @@
     </w:tbl>
     <w:p>
       <w:pPr>
-        <w:pStyle w:val="Heading2"/>
+        <w:pStyle w:val="Heading1"/>
       </w:pPr>
       <w:r>
-        <w:t>5.7 Ethics</w:t>
+        <w:t>12. Resources, Facilities and Ethical Considerations</w:t>
       </w:r>
     </w:p>
     <w:p>
@@ -4624,12 +3523,7 @@
           <w:i w:val="0"/>
           <w:sz w:val="22"/>
         </w:rPr>
-        <w:t>No human or animal subjects are involved. Marine field work will follow survey permitting, environmental best practice and any protected-area constraints; operator data will be governed by confidentiality/data-sharing agreements; outputs will be released openly where permitted.</w:t>
-      </w:r>
-    </w:p>
-    <w:p>
-      <w:r>
-        <w:br w:type="page"/>
+        <w:t>Resources required: HPC allocation for ensemble simulations; field instrumentation (CTD, ADCP, towed conductivity sensor) and vessel time for WP3; partnership with a desalination plant operator and the relevant environmental regulator. No human or animal subjects are involved; field work will follow marine-survey permitting and environmental best practice, and data-sharing agreements will govern operator-provided data. Software will be released open-source under an appropriate licence.</w:t>
       </w:r>
     </w:p>
     <w:p>
@@ -4637,142 +3531,7 @@
         <w:pStyle w:val="Heading1"/>
       </w:pPr>
       <w:r>
-        <w:t>6. Expected Contribution to Knowledge and Impact</w:t>
-      </w:r>
-    </w:p>
-    <w:p>
-      <w:pPr>
-        <w:spacing w:after="120"/>
-      </w:pPr>
-      <w:r>
-        <w:rPr>
-          <w:rFonts w:ascii="Calibri" w:hAnsi="Calibri"/>
-          <w:b w:val="0"/>
-          <w:i w:val="0"/>
-          <w:sz w:val="22"/>
-        </w:rPr>
-        <w:t>Original contributions:</w:t>
-      </w:r>
-    </w:p>
-    <w:p>
-      <w:pPr>
-        <w:pStyle w:val="ListBullet"/>
-        <w:spacing w:after="40"/>
-      </w:pPr>
-      <w:r>
-        <w:rPr>
-          <w:rFonts w:ascii="Calibri" w:hAnsi="Calibri"/>
-          <w:sz w:val="22"/>
-        </w:rPr>
-        <w:t>A validated, non-Boussinesq, stochastic coupled-PDE framework for dense effluent dispersion returning the salinity probability distribution.</w:t>
-      </w:r>
-    </w:p>
-    <w:p>
-      <w:pPr>
-        <w:pStyle w:val="ListBullet"/>
-        <w:spacing w:after="40"/>
-      </w:pPr>
-      <w:r>
-        <w:rPr>
-          <w:rFonts w:ascii="Calibri" w:hAnsi="Calibri"/>
-          <w:sz w:val="22"/>
-        </w:rPr>
-        <w:t>The first field validation of a coupled near-field/far-field stochastic model for brine outfalls, with an openly-published dataset.</w:t>
-      </w:r>
-    </w:p>
-    <w:p>
-      <w:pPr>
-        <w:pStyle w:val="ListBullet"/>
-        <w:spacing w:after="40"/>
-      </w:pPr>
-      <w:r>
-        <w:rPr>
-          <w:rFonts w:ascii="Calibri" w:hAnsi="Calibri"/>
-          <w:sz w:val="22"/>
-        </w:rPr>
-        <w:t>Quantification of the osmotic, cross-diffusion and jet-merging effects neglected by current practice.</w:t>
-      </w:r>
-    </w:p>
-    <w:p>
-      <w:pPr>
-        <w:pStyle w:val="ListBullet"/>
-        <w:spacing w:after="40"/>
-      </w:pPr>
-      <w:r>
-        <w:rPr>
-          <w:rFonts w:ascii="Calibri" w:hAnsi="Calibri"/>
-          <w:sz w:val="22"/>
-        </w:rPr>
-        <w:t>A machine-learning surrogate enabling probabilistic compliance screening, and an open decision-support tool with design guidance.</w:t>
-      </w:r>
-    </w:p>
-    <w:p>
-      <w:pPr>
-        <w:spacing w:after="120"/>
-      </w:pPr>
-      <w:r>
-        <w:rPr>
-          <w:rFonts w:ascii="Calibri" w:hAnsi="Calibri"/>
-          <w:b w:val="0"/>
-          <w:i w:val="0"/>
-          <w:sz w:val="22"/>
-        </w:rPr>
-        <w:t>Impact: scientifically, the work advances environmental fluid mechanics by unifying and validating couplings previously treated in isolation; practically, it equips desalination engineers and regulators with a risk-based predictive capability that supports low-impact outfall design and defensible consenting — timely given the rapid global growth of desalination and tightening marine protection.</w:t>
-      </w:r>
-    </w:p>
-    <w:p>
-      <w:pPr>
-        <w:pStyle w:val="Heading1"/>
-      </w:pPr>
-      <w:r>
-        <w:t>7. Dissemination Plan</w:t>
-      </w:r>
-    </w:p>
-    <w:p>
-      <w:pPr>
-        <w:pStyle w:val="ListBullet"/>
-        <w:spacing w:after="40"/>
-      </w:pPr>
-      <w:r>
-        <w:rPr>
-          <w:rFonts w:ascii="Calibri" w:hAnsi="Calibri"/>
-          <w:sz w:val="22"/>
-        </w:rPr>
-        <w:t>4–6 peer-reviewed papers (e.g. Water Research; Desalination; J. Hydraulic Engineering; Environmental Fluid Mechanics; Ocean Modelling).</w:t>
-      </w:r>
-    </w:p>
-    <w:p>
-      <w:pPr>
-        <w:pStyle w:val="ListBullet"/>
-        <w:spacing w:after="40"/>
-      </w:pPr>
-      <w:r>
-        <w:rPr>
-          <w:rFonts w:ascii="Calibri" w:hAnsi="Calibri"/>
-          <w:sz w:val="22"/>
-        </w:rPr>
-        <w:t>Conference presentations (IAHR, IDA, EGU) and an industry/regulator workshop.</w:t>
-      </w:r>
-    </w:p>
-    <w:p>
-      <w:pPr>
-        <w:pStyle w:val="ListBullet"/>
-        <w:spacing w:after="40"/>
-      </w:pPr>
-      <w:r>
-        <w:rPr>
-          <w:rFonts w:ascii="Calibri" w:hAnsi="Calibri"/>
-          <w:sz w:val="22"/>
-        </w:rPr>
-        <w:t>Open-source release of the validated solver and surrogate, with documentation and worked case studies.</w:t>
-      </w:r>
-    </w:p>
-    <w:p>
-      <w:pPr>
-        <w:pStyle w:val="Heading1"/>
-      </w:pPr>
-      <w:r>
-        <w:t>8. Indicative References</w:t>
+        <w:t>13. Indicative References</w:t>
       </w:r>
     </w:p>
     <w:p>
@@ -4798,20 +3557,7 @@
           <w:rFonts w:ascii="Calibri" w:hAnsi="Calibri"/>
           <w:sz w:val="19"/>
         </w:rPr>
-        <w:t>Roberts, P.J.W. &amp; Toms, G. (1987). Inclined dense jets in flowing current. J. Hydraulic Engineering, 113(3), 323–341.</w:t>
-      </w:r>
-    </w:p>
-    <w:p>
-      <w:pPr>
-        <w:spacing w:after="60"/>
-        <w:ind w:left="360" w:hanging="360"/>
-      </w:pPr>
-      <w:r>
-        <w:rPr>
-          <w:rFonts w:ascii="Calibri" w:hAnsi="Calibri"/>
-          <w:sz w:val="19"/>
-        </w:rPr>
-        <w:t>Cipollina, A. et al. (2005). Bench-scale investigation of inclined dense jets. J. Hydraulic Engineering, 131(11), 1017–1022.</w:t>
+        <w:t>Cipollina, A., Brucato, A., Grisafi, F. &amp; Nicosia, S. (2005). Bench-scale investigation of inclined dense jets. J. Hydraulic Engineering, 131(11).</w:t>
       </w:r>
     </w:p>
     <w:p>
@@ -4837,6 +3583,19 @@
           <w:rFonts w:ascii="Calibri" w:hAnsi="Calibri"/>
           <w:sz w:val="19"/>
         </w:rPr>
+        <w:t>Roberts, P.J.W. &amp; Toms, G. (1987). Inclined dense jets in flowing current. J. Hydraulic Engineering, 113(3).</w:t>
+      </w:r>
+    </w:p>
+    <w:p>
+      <w:pPr>
+        <w:spacing w:after="60"/>
+        <w:ind w:left="360" w:hanging="360"/>
+      </w:pPr>
+      <w:r>
+        <w:rPr>
+          <w:rFonts w:ascii="Calibri" w:hAnsi="Calibri"/>
+          <w:sz w:val="19"/>
+        </w:rPr>
         <w:t>Abessi, O. &amp; Roberts, P.J.W. (2015). Effect of nozzle orientation on dense jets in stagnant environments. J. Hydraulic Engineering, 141(8).</w:t>
       </w:r>
     </w:p>
@@ -4850,7 +3609,7 @@
           <w:rFonts w:ascii="Calibri" w:hAnsi="Calibri"/>
           <w:sz w:val="19"/>
         </w:rPr>
-        <w:t>Jirka, G.H. (2004). Integral model for turbulent buoyant jets, Part I. Environmental Fluid Mechanics, 4, 1–56.</w:t>
+        <w:t>Jirka, G.H. (2004). Integral model for turbulent buoyant jets in unbounded stratified flows. Environmental Fluid Mechanics, 4, 1–56.</w:t>
       </w:r>
     </w:p>
     <w:p>
@@ -4863,7 +3622,7 @@
           <w:rFonts w:ascii="Calibri" w:hAnsi="Calibri"/>
           <w:sz w:val="19"/>
         </w:rPr>
-        <w:t>Lee, J.H.W. &amp; Chu, V.H. (2003). Turbulent Jets and Plumes: A Lagrangian Approach. Kluwer.</w:t>
+        <w:t>Bleninger, T. &amp; Jirka, G.H. (2008). Modelling and environmentally sound management of brine discharges from desalination plants. Desalination, 221.</w:t>
       </w:r>
     </w:p>
     <w:p>
@@ -4876,7 +3635,7 @@
           <w:rFonts w:ascii="Calibri" w:hAnsi="Calibri"/>
           <w:sz w:val="19"/>
         </w:rPr>
-        <w:t>Bleninger, T. &amp; Jirka, G.H. (2008). Modelling and environmentally sound management of brine discharges from desalination plants. Desalination, 221, 585–597.</w:t>
+        <w:t>Fischer, H.B., List, E.J., Koh, R.C.Y., Imberger, J. &amp; Brooks, N.H. (1979). Mixing in Inland and Coastal Waters. Academic Press.</w:t>
       </w:r>
     </w:p>
     <w:p>
@@ -4889,7 +3648,7 @@
           <w:rFonts w:ascii="Calibri" w:hAnsi="Calibri"/>
           <w:sz w:val="19"/>
         </w:rPr>
-        <w:t>Fischer, H.B. et al. (1979). Mixing in Inland and Coastal Waters. Academic Press.</w:t>
+        <w:t>Missimer, T.M. &amp; Maliva, R.G. (2018). Environmental issues in seawater reverse osmosis desalination: intakes and outfalls. Desalination, 434.</w:t>
       </w:r>
     </w:p>
     <w:p>
@@ -4902,7 +3661,7 @@
           <w:rFonts w:ascii="Calibri" w:hAnsi="Calibri"/>
           <w:sz w:val="19"/>
         </w:rPr>
-        <w:t>Missimer, T.M. &amp; Maliva, R.G. (2018). Environmental issues in seawater reverse osmosis desalination: intakes and outfalls. Desalination, 434, 198–215.</w:t>
+        <w:t>IOC, SCOR &amp; IAPSO (2010). The international thermodynamic equation of seawater – 2010 (TEOS-10). UNESCO.</w:t>
       </w:r>
     </w:p>
     <w:p>
@@ -4915,33 +3674,7 @@
           <w:rFonts w:ascii="Calibri" w:hAnsi="Calibri"/>
           <w:sz w:val="19"/>
         </w:rPr>
-        <w:t>Roberts, D.A. et al. (2010). Impacts of desalination plant discharges on the marine environment: A review. Water Research, 44(18), 5117–5128.</w:t>
-      </w:r>
-    </w:p>
-    <w:p>
-      <w:pPr>
-        <w:spacing w:after="60"/>
-        <w:ind w:left="360" w:hanging="360"/>
-      </w:pPr>
-      <w:r>
-        <w:rPr>
-          <w:rFonts w:ascii="Calibri" w:hAnsi="Calibri"/>
-          <w:sz w:val="19"/>
-        </w:rPr>
-        <w:t>IOC, SCOR &amp; IAPSO (2010). The international thermodynamic equation of seawater – 2010 (TEOS-10). UNESCO, Manuals and Guides 56.</w:t>
-      </w:r>
-    </w:p>
-    <w:p>
-      <w:pPr>
-        <w:spacing w:after="60"/>
-        <w:ind w:left="360" w:hanging="360"/>
-      </w:pPr>
-      <w:r>
-        <w:rPr>
-          <w:rFonts w:ascii="Calibri" w:hAnsi="Calibri"/>
-          <w:sz w:val="19"/>
-        </w:rPr>
-        <w:t>Palomar, P. &amp; Losada, I.J. (2011). Impacts of brine discharge on the marine environment: Modelling as a predictive tool. Desalination, 167.</w:t>
+        <w:t>Roberts, D.A. et al. (2010). Impacts of desalination plant discharges on the marine environment: A review. Water Research, 44(18).</w:t>
       </w:r>
     </w:p>
     <w:sectPr>

</xml_diff>